<commit_message>
final changes davvide 17 dec
</commit_message>
<xml_diff>
--- a/report_data science project.docx
+++ b/report_data science project.docx
@@ -43,7 +43,25 @@
           <w:sz w:val="36"/>
           <w:szCs w:val="36"/>
         </w:rPr>
-        <w:t>Final Project</w:t>
+        <w:t xml:space="preserve">Final </w:t>
+      </w:r>
+      <w:commentRangeStart w:id="0"/>
+      <w:r>
+        <w:rPr>
+          <w:rFonts w:ascii="Arial" w:hAnsi="Arial" w:cs="Arial"/>
+          <w:b/>
+          <w:bCs/>
+          <w:sz w:val="36"/>
+          <w:szCs w:val="36"/>
+        </w:rPr>
+        <w:t>Project</w:t>
+      </w:r>
+      <w:commentRangeEnd w:id="0"/>
+      <w:r>
+        <w:rPr>
+          <w:rStyle w:val="CommentReference"/>
+        </w:rPr>
+        <w:commentReference w:id="0"/>
       </w:r>
     </w:p>
     <w:p>
@@ -171,7 +189,7 @@
                     </pic:cNvPicPr>
                   </pic:nvPicPr>
                   <pic:blipFill>
-                    <a:blip r:embed="rId8">
+                    <a:blip r:embed="rId12">
                       <a:extLst>
                         <a:ext uri="{28A0092B-C50C-407E-A947-70E740481C1C}">
                           <a14:useLocalDpi xmlns:a14="http://schemas.microsoft.com/office/drawing/2010/main" val="0"/>
@@ -279,7 +297,6 @@
           <w:lang w:val="pt-PT"/>
         </w:rPr>
       </w:pPr>
-      <w:proofErr w:type="spellStart"/>
       <w:r>
         <w:rPr>
           <w:rFonts w:ascii="Arial" w:hAnsi="Arial" w:cs="Arial"/>
@@ -287,17 +304,7 @@
           <w:bCs/>
           <w:lang w:val="pt-PT"/>
         </w:rPr>
-        <w:t>Turrina</w:t>
-      </w:r>
-      <w:proofErr w:type="spellEnd"/>
-      <w:r>
-        <w:rPr>
-          <w:rFonts w:ascii="Arial" w:hAnsi="Arial" w:cs="Arial"/>
-          <w:b/>
-          <w:bCs/>
-          <w:lang w:val="pt-PT"/>
-        </w:rPr>
-        <w:t>, Da</w:t>
+        <w:t>Turrina, Da</w:t>
       </w:r>
       <w:r>
         <w:rPr>
@@ -411,6 +418,14 @@
     </w:p>
     <w:sdt>
       <w:sdtPr>
+        <w:rPr>
+          <w:rFonts w:asciiTheme="minorHAnsi" w:eastAsiaTheme="minorHAnsi" w:hAnsiTheme="minorHAnsi" w:cstheme="minorBidi"/>
+          <w:color w:val="auto"/>
+          <w:kern w:val="2"/>
+          <w:sz w:val="24"/>
+          <w:szCs w:val="24"/>
+          <w14:ligatures w14:val="standardContextual"/>
+        </w:rPr>
         <w:id w:val="-1192844551"/>
         <w:docPartObj>
           <w:docPartGallery w:val="Table of Contents"/>
@@ -419,15 +434,9 @@
       </w:sdtPr>
       <w:sdtEndPr>
         <w:rPr>
-          <w:rFonts w:asciiTheme="minorHAnsi" w:eastAsiaTheme="minorHAnsi" w:hAnsiTheme="minorHAnsi" w:cstheme="minorBidi"/>
           <w:b/>
           <w:bCs/>
           <w:noProof/>
-          <w:color w:val="auto"/>
-          <w:kern w:val="2"/>
-          <w:sz w:val="24"/>
-          <w:szCs w:val="24"/>
-          <w14:ligatures w14:val="standardContextual"/>
         </w:rPr>
       </w:sdtEndPr>
       <w:sdtContent>
@@ -1489,7 +1498,7 @@
           <w:color w:val="auto"/>
         </w:rPr>
       </w:pPr>
-      <w:bookmarkStart w:id="0" w:name="_Toc216620288"/>
+      <w:bookmarkStart w:id="1" w:name="_Toc216620288"/>
       <w:r>
         <w:rPr>
           <w:rFonts w:ascii="Arial" w:hAnsi="Arial" w:cs="Arial"/>
@@ -1497,31 +1506,31 @@
         </w:rPr>
         <w:lastRenderedPageBreak/>
         <w:t>Introduction</w:t>
-      </w:r>
-      <w:bookmarkEnd w:id="0"/>
-    </w:p>
-    <w:p>
-      <w:pPr>
-        <w:pStyle w:val="Heading2"/>
-        <w:rPr>
-          <w:rFonts w:ascii="Arial" w:hAnsi="Arial" w:cs="Arial"/>
-        </w:rPr>
-      </w:pPr>
-      <w:r>
-        <w:tab/>
-      </w:r>
-      <w:bookmarkStart w:id="1" w:name="_Toc216620289"/>
-      <w:r>
-        <w:rPr>
-          <w:rFonts w:ascii="Arial" w:hAnsi="Arial" w:cs="Arial"/>
-          <w:color w:val="auto"/>
-        </w:rPr>
-        <w:t>Objectives</w:t>
       </w:r>
       <w:bookmarkEnd w:id="1"/>
     </w:p>
     <w:p>
       <w:pPr>
+        <w:pStyle w:val="Heading2"/>
+        <w:rPr>
+          <w:rFonts w:ascii="Arial" w:hAnsi="Arial" w:cs="Arial"/>
+        </w:rPr>
+      </w:pPr>
+      <w:r>
+        <w:tab/>
+      </w:r>
+      <w:bookmarkStart w:id="2" w:name="_Toc216620289"/>
+      <w:r>
+        <w:rPr>
+          <w:rFonts w:ascii="Arial" w:hAnsi="Arial" w:cs="Arial"/>
+          <w:color w:val="auto"/>
+        </w:rPr>
+        <w:t>Objectives</w:t>
+      </w:r>
+      <w:bookmarkEnd w:id="2"/>
+    </w:p>
+    <w:p>
+      <w:pPr>
         <w:spacing w:after="120" w:line="360" w:lineRule="auto"/>
         <w:jc w:val="both"/>
         <w:rPr>
@@ -1537,13 +1546,6 @@
           <w:szCs w:val="20"/>
         </w:rPr>
         <w:tab/>
-      </w:r>
-      <w:r>
-        <w:rPr>
-          <w:rFonts w:ascii="Arial" w:hAnsi="Arial" w:cs="Arial"/>
-          <w:sz w:val="20"/>
-          <w:szCs w:val="20"/>
-        </w:rPr>
         <w:t xml:space="preserve">The objective of this work is to analyze </w:t>
       </w:r>
       <w:r>
@@ -1816,25 +1818,7 @@
           <w:sz w:val="20"/>
           <w:szCs w:val="20"/>
         </w:rPr>
-        <w:t xml:space="preserve"> is </w:t>
-      </w:r>
-      <w:proofErr w:type="gramStart"/>
-      <w:r>
-        <w:rPr>
-          <w:rFonts w:ascii="Arial" w:hAnsi="Arial" w:cs="Arial"/>
-          <w:sz w:val="20"/>
-          <w:szCs w:val="20"/>
-        </w:rPr>
-        <w:t>used</w:t>
-      </w:r>
-      <w:proofErr w:type="gramEnd"/>
-      <w:r>
-        <w:rPr>
-          <w:rFonts w:ascii="Arial" w:hAnsi="Arial" w:cs="Arial"/>
-          <w:sz w:val="20"/>
-          <w:szCs w:val="20"/>
-        </w:rPr>
-        <w:t xml:space="preserve"> and the dimensionality reduction is based on a principal component analysis</w:t>
+        <w:t xml:space="preserve"> is used and the dimensionality reduction is based on a principal component analysis</w:t>
       </w:r>
       <w:r>
         <w:rPr>
@@ -1919,7 +1903,7 @@
           <w:color w:val="auto"/>
         </w:rPr>
       </w:pPr>
-      <w:bookmarkStart w:id="2" w:name="_Toc216620290"/>
+      <w:bookmarkStart w:id="3" w:name="_Toc216620290"/>
       <w:r>
         <w:rPr>
           <w:rFonts w:ascii="Arial" w:hAnsi="Arial" w:cs="Arial"/>
@@ -1927,7 +1911,7 @@
         </w:rPr>
         <w:t>Data</w:t>
       </w:r>
-      <w:bookmarkEnd w:id="2"/>
+      <w:bookmarkEnd w:id="3"/>
     </w:p>
     <w:p>
       <w:pPr>
@@ -2489,7 +2473,7 @@
           <w:color w:val="auto"/>
         </w:rPr>
       </w:pPr>
-      <w:bookmarkStart w:id="3" w:name="_Toc216620291"/>
+      <w:bookmarkStart w:id="4" w:name="_Toc216620291"/>
       <w:r>
         <w:rPr>
           <w:rFonts w:ascii="Arial" w:hAnsi="Arial" w:cs="Arial"/>
@@ -2498,7 +2482,7 @@
         <w:lastRenderedPageBreak/>
         <w:t>Methodology</w:t>
       </w:r>
-      <w:bookmarkEnd w:id="3"/>
+      <w:bookmarkEnd w:id="4"/>
     </w:p>
     <w:p>
       <w:pPr>
@@ -2541,18 +2525,8 @@
           <w:sz w:val="20"/>
           <w:szCs w:val="20"/>
         </w:rPr>
-        <w:t xml:space="preserve"> indicated </w:t>
-      </w:r>
-      <w:proofErr w:type="gramStart"/>
-      <w:r>
-        <w:rPr>
-          <w:rFonts w:ascii="Arial" w:hAnsi="Arial" w:cs="Arial"/>
-          <w:sz w:val="20"/>
-          <w:szCs w:val="20"/>
-        </w:rPr>
-        <w:t>before</w:t>
-      </w:r>
-      <w:proofErr w:type="gramEnd"/>
+        <w:t xml:space="preserve"> indicated before</w:t>
+      </w:r>
       <w:r>
         <w:rPr>
           <w:rFonts w:ascii="Arial" w:hAnsi="Arial" w:cs="Arial"/>
@@ -2735,15 +2709,7 @@
           <w:sz w:val="20"/>
           <w:szCs w:val="20"/>
         </w:rPr>
-        <w:t>Clustering</w:t>
-      </w:r>
-      <w:r>
-        <w:rPr>
-          <w:rFonts w:ascii="Arial" w:hAnsi="Arial" w:cs="Arial"/>
-          <w:sz w:val="20"/>
-          <w:szCs w:val="20"/>
-        </w:rPr>
-        <w:t xml:space="preserve"> daily electricity price profiles</w:t>
+        <w:t>Clustering daily electricity price profiles</w:t>
       </w:r>
     </w:p>
     <w:p>
@@ -2767,11 +2733,107 @@
           <w:sz w:val="20"/>
           <w:szCs w:val="20"/>
         </w:rPr>
-        <w:t>Application of PCA and comparison with the baseline regression model</w:t>
+        <w:t>Principal Component Analysis (PCA)</w:t>
       </w:r>
     </w:p>
     <w:p>
       <w:pPr>
+        <w:pStyle w:val="ListParagraph"/>
+        <w:numPr>
+          <w:ilvl w:val="0"/>
+          <w:numId w:val="25"/>
+        </w:numPr>
+        <w:spacing w:after="120" w:line="360" w:lineRule="auto"/>
+        <w:jc w:val="both"/>
+        <w:rPr>
+          <w:rFonts w:ascii="Arial" w:hAnsi="Arial" w:cs="Arial"/>
+          <w:sz w:val="20"/>
+          <w:szCs w:val="20"/>
+        </w:rPr>
+      </w:pPr>
+      <w:r>
+        <w:rPr>
+          <w:rFonts w:ascii="Arial" w:hAnsi="Arial" w:cs="Arial"/>
+          <w:sz w:val="20"/>
+          <w:szCs w:val="20"/>
+        </w:rPr>
+        <w:t>PCA-based regression and comparison</w:t>
+      </w:r>
+    </w:p>
+    <w:p>
+      <w:pPr>
+        <w:pStyle w:val="ListParagraph"/>
+        <w:numPr>
+          <w:ilvl w:val="0"/>
+          <w:numId w:val="25"/>
+        </w:numPr>
+        <w:spacing w:after="120" w:line="360" w:lineRule="auto"/>
+        <w:jc w:val="both"/>
+        <w:rPr>
+          <w:rFonts w:ascii="Arial" w:hAnsi="Arial" w:cs="Arial"/>
+          <w:sz w:val="20"/>
+          <w:szCs w:val="20"/>
+        </w:rPr>
+      </w:pPr>
+      <w:r>
+        <w:rPr>
+          <w:rFonts w:ascii="Arial" w:hAnsi="Arial" w:cs="Arial"/>
+          <w:sz w:val="20"/>
+          <w:szCs w:val="20"/>
+        </w:rPr>
+        <w:t>Findings</w:t>
+      </w:r>
+    </w:p>
+    <w:p>
+      <w:pPr>
+        <w:pStyle w:val="ListParagraph"/>
+        <w:numPr>
+          <w:ilvl w:val="0"/>
+          <w:numId w:val="25"/>
+        </w:numPr>
+        <w:spacing w:after="120" w:line="360" w:lineRule="auto"/>
+        <w:jc w:val="both"/>
+        <w:rPr>
+          <w:rFonts w:ascii="Arial" w:hAnsi="Arial" w:cs="Arial"/>
+          <w:sz w:val="20"/>
+          <w:szCs w:val="20"/>
+        </w:rPr>
+      </w:pPr>
+      <w:r>
+        <w:rPr>
+          <w:rFonts w:ascii="Arial" w:hAnsi="Arial" w:cs="Arial"/>
+          <w:sz w:val="20"/>
+          <w:szCs w:val="20"/>
+        </w:rPr>
+        <w:t>Conclusions</w:t>
+      </w:r>
+    </w:p>
+    <w:p>
+      <w:pPr>
+        <w:pStyle w:val="ListParagraph"/>
+        <w:numPr>
+          <w:ilvl w:val="0"/>
+          <w:numId w:val="25"/>
+        </w:numPr>
+        <w:spacing w:after="120" w:line="360" w:lineRule="auto"/>
+        <w:jc w:val="both"/>
+        <w:rPr>
+          <w:rFonts w:ascii="Arial" w:hAnsi="Arial" w:cs="Arial"/>
+          <w:sz w:val="20"/>
+          <w:szCs w:val="20"/>
+        </w:rPr>
+      </w:pPr>
+      <w:r>
+        <w:rPr>
+          <w:rFonts w:ascii="Arial" w:hAnsi="Arial" w:cs="Arial"/>
+          <w:sz w:val="20"/>
+          <w:szCs w:val="20"/>
+        </w:rPr>
+        <w:t>Challenges faced</w:t>
+      </w:r>
+    </w:p>
+    <w:p>
+      <w:pPr>
         <w:pStyle w:val="Heading2"/>
         <w:ind w:firstLine="357"/>
         <w:rPr>
@@ -2779,39 +2841,39 @@
           <w:color w:val="auto"/>
         </w:rPr>
       </w:pPr>
-      <w:bookmarkStart w:id="4" w:name="_Toc216620292"/>
+      <w:bookmarkStart w:id="5" w:name="_Toc216620292"/>
       <w:r>
         <w:rPr>
           <w:rFonts w:ascii="Arial" w:hAnsi="Arial" w:cs="Arial"/>
           <w:color w:val="auto"/>
         </w:rPr>
         <w:t>Data collection, cleaning and preprocessing</w:t>
-      </w:r>
-      <w:bookmarkEnd w:id="4"/>
-    </w:p>
-    <w:p>
-      <w:pPr>
-        <w:pStyle w:val="Heading3"/>
-        <w:rPr>
-          <w:rFonts w:ascii="Arial" w:hAnsi="Arial" w:cs="Arial"/>
-          <w:color w:val="auto"/>
-        </w:rPr>
-      </w:pPr>
-      <w:r>
-        <w:tab/>
-      </w:r>
-      <w:bookmarkStart w:id="5" w:name="_Toc216620293"/>
-      <w:r>
-        <w:rPr>
-          <w:rFonts w:ascii="Arial" w:hAnsi="Arial" w:cs="Arial"/>
-          <w:color w:val="auto"/>
-        </w:rPr>
-        <w:t>Data collection</w:t>
       </w:r>
       <w:bookmarkEnd w:id="5"/>
     </w:p>
     <w:p>
       <w:pPr>
+        <w:pStyle w:val="Heading3"/>
+        <w:rPr>
+          <w:rFonts w:ascii="Arial" w:hAnsi="Arial" w:cs="Arial"/>
+          <w:color w:val="auto"/>
+        </w:rPr>
+      </w:pPr>
+      <w:r>
+        <w:tab/>
+      </w:r>
+      <w:bookmarkStart w:id="6" w:name="_Toc216620293"/>
+      <w:r>
+        <w:rPr>
+          <w:rFonts w:ascii="Arial" w:hAnsi="Arial" w:cs="Arial"/>
+          <w:color w:val="auto"/>
+        </w:rPr>
+        <w:t>Data collection</w:t>
+      </w:r>
+      <w:bookmarkEnd w:id="6"/>
+    </w:p>
+    <w:p>
+      <w:pPr>
         <w:spacing w:after="120" w:line="360" w:lineRule="auto"/>
         <w:jc w:val="both"/>
         <w:rPr>
@@ -2893,25 +2955,7 @@
           <w:sz w:val="20"/>
           <w:szCs w:val="20"/>
         </w:rPr>
-        <w:t>, including demand, generation by technology, market-</w:t>
-      </w:r>
-      <w:proofErr w:type="gramStart"/>
-      <w:r>
-        <w:rPr>
-          <w:rFonts w:ascii="Arial" w:hAnsi="Arial" w:cs="Arial"/>
-          <w:sz w:val="20"/>
-          <w:szCs w:val="20"/>
-        </w:rPr>
-        <w:t>cleared</w:t>
-      </w:r>
-      <w:proofErr w:type="gramEnd"/>
-      <w:r>
-        <w:rPr>
-          <w:rFonts w:ascii="Arial" w:hAnsi="Arial" w:cs="Arial"/>
-          <w:sz w:val="20"/>
-          <w:szCs w:val="20"/>
-        </w:rPr>
-        <w:t xml:space="preserve"> energy, and price information.</w:t>
+        <w:t>, including demand, generation by technology, market-cleared energy, and price information.</w:t>
       </w:r>
     </w:p>
     <w:p>
@@ -3055,6 +3099,17 @@
         </w:rPr>
         <w:t>.</w:t>
       </w:r>
+    </w:p>
+    <w:p>
+      <w:pPr>
+        <w:spacing w:after="120" w:line="360" w:lineRule="auto"/>
+        <w:jc w:val="both"/>
+        <w:rPr>
+          <w:rFonts w:ascii="Arial" w:hAnsi="Arial" w:cs="Arial"/>
+          <w:sz w:val="20"/>
+          <w:szCs w:val="20"/>
+        </w:rPr>
+      </w:pPr>
     </w:p>
     <w:p>
       <w:pPr>
@@ -3069,7 +3124,7 @@
           <w:szCs w:val="28"/>
         </w:rPr>
       </w:pPr>
-      <w:bookmarkStart w:id="6" w:name="_Toc216620294"/>
+      <w:bookmarkStart w:id="7" w:name="_Toc216620294"/>
       <w:r>
         <w:rPr>
           <w:rFonts w:ascii="Arial" w:eastAsiaTheme="majorEastAsia" w:hAnsi="Arial" w:cs="Arial"/>
@@ -3086,7 +3141,7 @@
         </w:rPr>
         <w:t>leaning and preprocessing</w:t>
       </w:r>
-      <w:bookmarkEnd w:id="6"/>
+      <w:bookmarkEnd w:id="7"/>
     </w:p>
     <w:p>
       <w:pPr>
@@ -3197,7 +3252,66 @@
           <w:sz w:val="20"/>
           <w:szCs w:val="20"/>
         </w:rPr>
-        <w:t xml:space="preserve"> The first steps are crucial, in accordance with the rule of thumb “Trash in, trash out”. </w:t>
+        <w:t xml:space="preserve"> The first steps are crucial, in accordance with the </w:t>
+      </w:r>
+      <w:r>
+        <w:rPr>
+          <w:rFonts w:ascii="Arial" w:hAnsi="Arial" w:cs="Arial"/>
+          <w:sz w:val="20"/>
+          <w:szCs w:val="20"/>
+        </w:rPr>
+        <w:t xml:space="preserve">rule of thumb “Trash in, trash out”. </w:t>
+      </w:r>
+    </w:p>
+    <w:p>
+      <w:pPr>
+        <w:spacing w:after="120" w:line="360" w:lineRule="auto"/>
+        <w:jc w:val="both"/>
+        <w:rPr>
+          <w:rFonts w:ascii="Arial" w:hAnsi="Arial" w:cs="Arial"/>
+          <w:sz w:val="20"/>
+          <w:szCs w:val="20"/>
+          <w:lang w:val="en-GB"/>
+        </w:rPr>
+      </w:pPr>
+      <w:r>
+        <w:rPr>
+          <w:rFonts w:ascii="Arial" w:hAnsi="Arial" w:cs="Arial"/>
+          <w:sz w:val="20"/>
+          <w:szCs w:val="20"/>
+          <w:lang w:val="en-GB"/>
+        </w:rPr>
+        <w:lastRenderedPageBreak/>
+        <w:t xml:space="preserve">Timestamps were standardized to a uniform datetime format, duplicates were removed, and the data was ordered chronologically. The continuity of the hourly time series was verified by checking for missing timestamps. All timestamps were converted to </w:t>
+      </w:r>
+      <w:proofErr w:type="spellStart"/>
+      <w:r>
+        <w:rPr>
+          <w:rFonts w:ascii="Arial" w:hAnsi="Arial" w:cs="Arial"/>
+          <w:sz w:val="20"/>
+          <w:szCs w:val="20"/>
+          <w:lang w:val="en-GB"/>
+        </w:rPr>
+        <w:t>timezone</w:t>
+      </w:r>
+      <w:proofErr w:type="spellEnd"/>
+      <w:r>
+        <w:rPr>
+          <w:rFonts w:ascii="Arial" w:hAnsi="Arial" w:cs="Arial"/>
+          <w:sz w:val="20"/>
+          <w:szCs w:val="20"/>
+          <w:lang w:val="en-GB"/>
+        </w:rPr>
+        <w:t>-naive datetime objects to ensure consistent alignment across data sources and to prevent issues during merging, feature engineering, and temporal splitting.</w:t>
+      </w:r>
+      <w:r>
+        <w:rPr>
+          <w:rFonts w:ascii="Arial" w:hAnsi="Arial" w:cs="Arial"/>
+          <w:sz w:val="20"/>
+          <w:szCs w:val="20"/>
+          <w:lang w:val="en-GB"/>
+        </w:rPr>
+        <w:t xml:space="preserve"> </w:t>
       </w:r>
     </w:p>
     <w:p>
@@ -3217,23 +3331,71 @@
           <w:sz w:val="20"/>
           <w:szCs w:val="20"/>
         </w:rPr>
-        <w:t>First</w:t>
-      </w:r>
-      <w:r>
-        <w:rPr>
-          <w:rFonts w:ascii="Arial" w:hAnsi="Arial" w:cs="Arial"/>
-          <w:sz w:val="20"/>
-          <w:szCs w:val="20"/>
-        </w:rPr>
-        <w:t>ly</w:t>
-      </w:r>
-      <w:r>
-        <w:rPr>
-          <w:rFonts w:ascii="Arial" w:hAnsi="Arial" w:cs="Arial"/>
-          <w:sz w:val="20"/>
-          <w:szCs w:val="20"/>
-        </w:rPr>
-        <w:t xml:space="preserve">, </w:t>
+        <w:t>Not all m</w:t>
+      </w:r>
+      <w:r>
+        <w:rPr>
+          <w:rFonts w:ascii="Arial" w:hAnsi="Arial" w:cs="Arial"/>
+          <w:sz w:val="20"/>
+          <w:szCs w:val="20"/>
+        </w:rPr>
+        <w:t xml:space="preserve">issing values were handled </w:t>
+      </w:r>
+      <w:r>
+        <w:rPr>
+          <w:rFonts w:ascii="Arial" w:hAnsi="Arial" w:cs="Arial"/>
+          <w:sz w:val="20"/>
+          <w:szCs w:val="20"/>
+        </w:rPr>
+        <w:t>the same way, since not all variables came from the same nature</w:t>
+      </w:r>
+      <w:r>
+        <w:rPr>
+          <w:rFonts w:ascii="Arial" w:hAnsi="Arial" w:cs="Arial"/>
+          <w:sz w:val="20"/>
+          <w:szCs w:val="20"/>
+        </w:rPr>
+        <w:t>. Scheduled generation variables were imputed with zero when missing, under the assumption that</w:t>
+      </w:r>
+      <w:r>
+        <w:rPr>
+          <w:rFonts w:ascii="Arial" w:hAnsi="Arial" w:cs="Arial"/>
+          <w:sz w:val="20"/>
+          <w:szCs w:val="20"/>
+        </w:rPr>
+        <w:t xml:space="preserve"> </w:t>
+      </w:r>
+      <w:r>
+        <w:rPr>
+          <w:rFonts w:ascii="Arial" w:hAnsi="Arial" w:cs="Arial"/>
+          <w:sz w:val="20"/>
+          <w:szCs w:val="20"/>
+        </w:rPr>
+        <w:t xml:space="preserve">the absence of a schedule entry corresponds to no planned generation. </w:t>
+      </w:r>
+      <w:r>
+        <w:rPr>
+          <w:rFonts w:ascii="Arial" w:hAnsi="Arial" w:cs="Arial"/>
+          <w:sz w:val="20"/>
+          <w:szCs w:val="20"/>
+        </w:rPr>
+        <w:t>While m</w:t>
+      </w:r>
+      <w:r>
+        <w:rPr>
+          <w:rFonts w:ascii="Arial" w:hAnsi="Arial" w:cs="Arial"/>
+          <w:sz w:val="20"/>
+          <w:szCs w:val="20"/>
+        </w:rPr>
+        <w:t>issing values in the day-ahead allocated energy were treated using linear interpolation followed by forward filling.</w:t>
+      </w:r>
+      <w:r>
+        <w:rPr>
+          <w:rFonts w:ascii="Arial" w:hAnsi="Arial" w:cs="Arial"/>
+          <w:sz w:val="20"/>
+          <w:szCs w:val="20"/>
+        </w:rPr>
+        <w:t xml:space="preserve"> </w:t>
       </w:r>
       <w:proofErr w:type="gramStart"/>
       <w:r>
@@ -3242,7 +3404,7 @@
           <w:sz w:val="20"/>
           <w:szCs w:val="20"/>
         </w:rPr>
-        <w:t>timestamps were</w:t>
+        <w:t>Later on</w:t>
       </w:r>
       <w:proofErr w:type="gramEnd"/>
       <w:r>
@@ -3251,57 +3413,208 @@
           <w:sz w:val="20"/>
           <w:szCs w:val="20"/>
         </w:rPr>
-        <w:t xml:space="preserve"> converted </w:t>
-      </w:r>
-      <w:r>
-        <w:rPr>
-          <w:rFonts w:ascii="Arial" w:hAnsi="Arial" w:cs="Arial"/>
-          <w:sz w:val="20"/>
-          <w:szCs w:val="20"/>
-        </w:rPr>
-        <w:t>in</w:t>
-      </w:r>
-      <w:r>
-        <w:rPr>
-          <w:rFonts w:ascii="Arial" w:hAnsi="Arial" w:cs="Arial"/>
-          <w:sz w:val="20"/>
-          <w:szCs w:val="20"/>
-        </w:rPr>
-        <w:t xml:space="preserve">to a uniform, </w:t>
-      </w:r>
-      <w:proofErr w:type="spellStart"/>
-      <w:r>
-        <w:rPr>
-          <w:rFonts w:ascii="Arial" w:hAnsi="Arial" w:cs="Arial"/>
-          <w:sz w:val="20"/>
-          <w:szCs w:val="20"/>
-        </w:rPr>
-        <w:t>timezone</w:t>
-      </w:r>
-      <w:proofErr w:type="spellEnd"/>
-      <w:r>
-        <w:rPr>
-          <w:rFonts w:ascii="Arial" w:hAnsi="Arial" w:cs="Arial"/>
-          <w:sz w:val="20"/>
-          <w:szCs w:val="20"/>
-        </w:rPr>
-        <w:t>-consistent format. Duplicate</w:t>
-      </w:r>
-      <w:r>
-        <w:rPr>
-          <w:rFonts w:ascii="Arial" w:hAnsi="Arial" w:cs="Arial"/>
-          <w:sz w:val="20"/>
-          <w:szCs w:val="20"/>
-        </w:rPr>
-        <w:t>s</w:t>
-      </w:r>
-      <w:r>
-        <w:rPr>
-          <w:rFonts w:ascii="Arial" w:hAnsi="Arial" w:cs="Arial"/>
-          <w:sz w:val="20"/>
-          <w:szCs w:val="20"/>
-        </w:rPr>
-        <w:t xml:space="preserve"> were removed and the data was sorted chronologically. The presence of missing timestamps was verified to ensure continuity of the hourly time series.</w:t>
+        <w:t>, t</w:t>
+      </w:r>
+      <w:r>
+        <w:rPr>
+          <w:rFonts w:ascii="Arial" w:hAnsi="Arial" w:cs="Arial"/>
+          <w:sz w:val="20"/>
+          <w:szCs w:val="20"/>
+        </w:rPr>
+        <w:t xml:space="preserve">he creation of lagged features introduced undefined values at the beginning of the dataset; these initial observations were removed </w:t>
+      </w:r>
+      <w:r>
+        <w:rPr>
+          <w:rFonts w:ascii="Arial" w:hAnsi="Arial" w:cs="Arial"/>
+          <w:sz w:val="20"/>
+          <w:szCs w:val="20"/>
+        </w:rPr>
+        <w:t xml:space="preserve">in order </w:t>
+      </w:r>
+      <w:r>
+        <w:rPr>
+          <w:rFonts w:ascii="Arial" w:hAnsi="Arial" w:cs="Arial"/>
+          <w:sz w:val="20"/>
+          <w:szCs w:val="20"/>
+        </w:rPr>
+        <w:t xml:space="preserve">to guarantee complete feature availability </w:t>
+      </w:r>
+      <w:r>
+        <w:rPr>
+          <w:rFonts w:ascii="Arial" w:hAnsi="Arial" w:cs="Arial"/>
+          <w:sz w:val="20"/>
+          <w:szCs w:val="20"/>
+        </w:rPr>
+        <w:t xml:space="preserve">in all </w:t>
+      </w:r>
+      <w:r>
+        <w:rPr>
+          <w:rFonts w:ascii="Arial" w:hAnsi="Arial" w:cs="Arial"/>
+          <w:sz w:val="20"/>
+          <w:szCs w:val="20"/>
+        </w:rPr>
+        <w:t>samples used</w:t>
+      </w:r>
+      <w:r>
+        <w:rPr>
+          <w:rFonts w:ascii="Arial" w:hAnsi="Arial" w:cs="Arial"/>
+          <w:sz w:val="20"/>
+          <w:szCs w:val="20"/>
+        </w:rPr>
+        <w:t>.</w:t>
+      </w:r>
+      <w:r>
+        <w:rPr>
+          <w:rFonts w:ascii="Arial" w:hAnsi="Arial" w:cs="Arial"/>
+          <w:sz w:val="20"/>
+          <w:szCs w:val="20"/>
+        </w:rPr>
+        <w:t xml:space="preserve"> </w:t>
+      </w:r>
+    </w:p>
+    <w:p>
+      <w:pPr>
+        <w:pStyle w:val="Heading2"/>
+        <w:ind w:firstLine="357"/>
+        <w:rPr>
+          <w:rFonts w:ascii="Arial" w:hAnsi="Arial" w:cs="Arial"/>
+          <w:color w:val="auto"/>
+        </w:rPr>
+      </w:pPr>
+      <w:bookmarkStart w:id="8" w:name="_Toc216620295"/>
+      <w:r>
+        <w:rPr>
+          <w:rFonts w:ascii="Arial" w:hAnsi="Arial" w:cs="Arial"/>
+          <w:color w:val="auto"/>
+        </w:rPr>
+        <w:t>Exploratory Data Analysis (EDA)</w:t>
+      </w:r>
+      <w:bookmarkEnd w:id="8"/>
+    </w:p>
+    <w:p>
+      <w:pPr>
+        <w:spacing w:after="120" w:line="360" w:lineRule="auto"/>
+        <w:jc w:val="both"/>
+        <w:rPr>
+          <w:rFonts w:ascii="Arial" w:hAnsi="Arial" w:cs="Arial"/>
+          <w:sz w:val="20"/>
+          <w:szCs w:val="20"/>
+        </w:rPr>
+      </w:pPr>
+      <w:r>
+        <w:tab/>
+      </w:r>
+      <w:r>
+        <w:rPr>
+          <w:rFonts w:ascii="Arial" w:hAnsi="Arial" w:cs="Arial"/>
+          <w:sz w:val="20"/>
+          <w:szCs w:val="20"/>
+        </w:rPr>
+        <w:t xml:space="preserve">Once the input dataset was considered, an EDA was conducted. Said analysis helps understanding the selected variables considering their </w:t>
+      </w:r>
+      <w:r>
+        <w:rPr>
+          <w:rFonts w:ascii="Arial" w:hAnsi="Arial" w:cs="Arial"/>
+          <w:sz w:val="20"/>
+          <w:szCs w:val="20"/>
+        </w:rPr>
+        <w:t xml:space="preserve">statistical properties, temporal behavior, and </w:t>
+      </w:r>
+      <w:r>
+        <w:rPr>
+          <w:rFonts w:ascii="Arial" w:hAnsi="Arial" w:cs="Arial"/>
+          <w:sz w:val="20"/>
+          <w:szCs w:val="20"/>
+        </w:rPr>
+        <w:t>cor</w:t>
+      </w:r>
+      <w:r>
+        <w:rPr>
+          <w:rFonts w:ascii="Arial" w:hAnsi="Arial" w:cs="Arial"/>
+          <w:sz w:val="20"/>
+          <w:szCs w:val="20"/>
+        </w:rPr>
+        <w:t>relation</w:t>
+      </w:r>
+      <w:r>
+        <w:rPr>
+          <w:rFonts w:ascii="Arial" w:hAnsi="Arial" w:cs="Arial"/>
+          <w:sz w:val="20"/>
+          <w:szCs w:val="20"/>
+        </w:rPr>
+        <w:t xml:space="preserve"> </w:t>
+      </w:r>
+      <w:r>
+        <w:rPr>
+          <w:rFonts w:ascii="Arial" w:hAnsi="Arial" w:cs="Arial"/>
+          <w:sz w:val="20"/>
+          <w:szCs w:val="20"/>
+        </w:rPr>
+        <w:t>between</w:t>
+      </w:r>
+      <w:r>
+        <w:rPr>
+          <w:rFonts w:ascii="Arial" w:hAnsi="Arial" w:cs="Arial"/>
+          <w:sz w:val="20"/>
+          <w:szCs w:val="20"/>
+        </w:rPr>
+        <w:t xml:space="preserve"> them and the target. </w:t>
+      </w:r>
+      <w:r>
+        <w:rPr>
+          <w:rFonts w:ascii="Arial" w:hAnsi="Arial" w:cs="Arial"/>
+          <w:sz w:val="20"/>
+          <w:szCs w:val="20"/>
+        </w:rPr>
+        <w:t xml:space="preserve">This step </w:t>
+      </w:r>
+      <w:r>
+        <w:rPr>
+          <w:rFonts w:ascii="Arial" w:hAnsi="Arial" w:cs="Arial"/>
+          <w:sz w:val="20"/>
+          <w:szCs w:val="20"/>
+        </w:rPr>
+        <w:t xml:space="preserve">helps to identify </w:t>
+      </w:r>
+      <w:r>
+        <w:rPr>
+          <w:rFonts w:ascii="Arial" w:hAnsi="Arial" w:cs="Arial"/>
+          <w:sz w:val="20"/>
+          <w:szCs w:val="20"/>
+        </w:rPr>
+        <w:t>anomalies,</w:t>
+      </w:r>
+      <w:r>
+        <w:rPr>
+          <w:rFonts w:ascii="Arial" w:hAnsi="Arial" w:cs="Arial"/>
+          <w:sz w:val="20"/>
+          <w:szCs w:val="20"/>
+        </w:rPr>
+        <w:t xml:space="preserve"> patterns</w:t>
+      </w:r>
+      <w:r>
+        <w:rPr>
+          <w:rFonts w:ascii="Arial" w:hAnsi="Arial" w:cs="Arial"/>
+          <w:sz w:val="20"/>
+          <w:szCs w:val="20"/>
+        </w:rPr>
+        <w:t xml:space="preserve"> and potential predictors prior to</w:t>
+      </w:r>
+      <w:r>
+        <w:rPr>
+          <w:rFonts w:ascii="Arial" w:hAnsi="Arial" w:cs="Arial"/>
+          <w:sz w:val="20"/>
+          <w:szCs w:val="20"/>
+        </w:rPr>
+        <w:t xml:space="preserve"> the </w:t>
+      </w:r>
+      <w:r>
+        <w:rPr>
+          <w:rFonts w:ascii="Arial" w:hAnsi="Arial" w:cs="Arial"/>
+          <w:sz w:val="20"/>
+          <w:szCs w:val="20"/>
+        </w:rPr>
+        <w:t>model development.</w:t>
       </w:r>
     </w:p>
     <w:p>
@@ -3321,31 +3634,15 @@
           <w:sz w:val="20"/>
           <w:szCs w:val="20"/>
         </w:rPr>
-        <w:t>Not all m</w:t>
-      </w:r>
-      <w:r>
-        <w:rPr>
-          <w:rFonts w:ascii="Arial" w:hAnsi="Arial" w:cs="Arial"/>
-          <w:sz w:val="20"/>
-          <w:szCs w:val="20"/>
-        </w:rPr>
-        <w:t xml:space="preserve">issing values were handled </w:t>
-      </w:r>
-      <w:r>
-        <w:rPr>
-          <w:rFonts w:ascii="Arial" w:hAnsi="Arial" w:cs="Arial"/>
-          <w:sz w:val="20"/>
-          <w:szCs w:val="20"/>
-        </w:rPr>
-        <w:t>the same way, since not all variables came from the same nature</w:t>
-      </w:r>
-      <w:r>
-        <w:rPr>
-          <w:rFonts w:ascii="Arial" w:hAnsi="Arial" w:cs="Arial"/>
-          <w:sz w:val="20"/>
-          <w:szCs w:val="20"/>
-        </w:rPr>
-        <w:t>. Scheduled generation variables were imputed with zero when missing, under the assumption that</w:t>
+        <w:t>Descriptive statistics were computed for all variables, including measures of central tendency, dispersion, skewness, and kurtosis</w:t>
+      </w:r>
+      <w:r>
+        <w:rPr>
+          <w:rFonts w:ascii="Arial" w:hAnsi="Arial" w:cs="Arial"/>
+          <w:sz w:val="20"/>
+          <w:szCs w:val="20"/>
+        </w:rPr>
+        <w:t>,</w:t>
       </w:r>
       <w:r>
         <w:rPr>
@@ -3361,261 +3658,23 @@
           <w:sz w:val="20"/>
           <w:szCs w:val="20"/>
         </w:rPr>
-        <w:t xml:space="preserve">the absence of a schedule entry corresponds to no planned generation. </w:t>
-      </w:r>
-      <w:r>
-        <w:rPr>
-          <w:rFonts w:ascii="Arial" w:hAnsi="Arial" w:cs="Arial"/>
-          <w:sz w:val="20"/>
-          <w:szCs w:val="20"/>
-        </w:rPr>
-        <w:t>While m</w:t>
-      </w:r>
-      <w:r>
-        <w:rPr>
-          <w:rFonts w:ascii="Arial" w:hAnsi="Arial" w:cs="Arial"/>
-          <w:sz w:val="20"/>
-          <w:szCs w:val="20"/>
-        </w:rPr>
-        <w:t>issing values in the day-ahead allocated energy were treated using linear interpolation followed by forward filling.</w:t>
-      </w:r>
-      <w:r>
-        <w:rPr>
-          <w:rFonts w:ascii="Arial" w:hAnsi="Arial" w:cs="Arial"/>
-          <w:sz w:val="20"/>
-          <w:szCs w:val="20"/>
-        </w:rPr>
-        <w:t xml:space="preserve"> </w:t>
-      </w:r>
-      <w:proofErr w:type="gramStart"/>
-      <w:r>
-        <w:rPr>
-          <w:rFonts w:ascii="Arial" w:hAnsi="Arial" w:cs="Arial"/>
-          <w:sz w:val="20"/>
-          <w:szCs w:val="20"/>
-        </w:rPr>
-        <w:t>Later on</w:t>
-      </w:r>
-      <w:proofErr w:type="gramEnd"/>
-      <w:r>
-        <w:rPr>
-          <w:rFonts w:ascii="Arial" w:hAnsi="Arial" w:cs="Arial"/>
-          <w:sz w:val="20"/>
-          <w:szCs w:val="20"/>
-        </w:rPr>
-        <w:t>, t</w:t>
-      </w:r>
-      <w:r>
-        <w:rPr>
-          <w:rFonts w:ascii="Arial" w:hAnsi="Arial" w:cs="Arial"/>
-          <w:sz w:val="20"/>
-          <w:szCs w:val="20"/>
-        </w:rPr>
-        <w:t xml:space="preserve">he </w:t>
-      </w:r>
-      <w:r>
-        <w:rPr>
-          <w:rFonts w:ascii="Arial" w:hAnsi="Arial" w:cs="Arial"/>
-          <w:sz w:val="20"/>
-          <w:szCs w:val="20"/>
-        </w:rPr>
-        <w:lastRenderedPageBreak/>
-        <w:t xml:space="preserve">creation of lagged features introduced undefined values at the beginning of the dataset; these initial observations were removed </w:t>
-      </w:r>
-      <w:proofErr w:type="gramStart"/>
-      <w:r>
-        <w:rPr>
-          <w:rFonts w:ascii="Arial" w:hAnsi="Arial" w:cs="Arial"/>
-          <w:sz w:val="20"/>
-          <w:szCs w:val="20"/>
-        </w:rPr>
-        <w:t xml:space="preserve">in order </w:t>
-      </w:r>
-      <w:r>
-        <w:rPr>
-          <w:rFonts w:ascii="Arial" w:hAnsi="Arial" w:cs="Arial"/>
-          <w:sz w:val="20"/>
-          <w:szCs w:val="20"/>
-        </w:rPr>
-        <w:t>to</w:t>
-      </w:r>
-      <w:proofErr w:type="gramEnd"/>
-      <w:r>
-        <w:rPr>
-          <w:rFonts w:ascii="Arial" w:hAnsi="Arial" w:cs="Arial"/>
-          <w:sz w:val="20"/>
-          <w:szCs w:val="20"/>
-        </w:rPr>
-        <w:t xml:space="preserve"> guarantee complete feature availability </w:t>
-      </w:r>
-      <w:r>
-        <w:rPr>
-          <w:rFonts w:ascii="Arial" w:hAnsi="Arial" w:cs="Arial"/>
-          <w:sz w:val="20"/>
-          <w:szCs w:val="20"/>
-        </w:rPr>
-        <w:t xml:space="preserve">in all </w:t>
-      </w:r>
-      <w:r>
-        <w:rPr>
-          <w:rFonts w:ascii="Arial" w:hAnsi="Arial" w:cs="Arial"/>
-          <w:sz w:val="20"/>
-          <w:szCs w:val="20"/>
-        </w:rPr>
-        <w:t>samples used</w:t>
-      </w:r>
-      <w:r>
-        <w:rPr>
-          <w:rFonts w:ascii="Arial" w:hAnsi="Arial" w:cs="Arial"/>
-          <w:sz w:val="20"/>
-          <w:szCs w:val="20"/>
-        </w:rPr>
-        <w:t>.</w:t>
-      </w:r>
-    </w:p>
-    <w:p>
-      <w:pPr>
-        <w:pStyle w:val="Heading2"/>
-        <w:ind w:firstLine="357"/>
-        <w:rPr>
-          <w:rFonts w:ascii="Arial" w:hAnsi="Arial" w:cs="Arial"/>
-          <w:color w:val="auto"/>
-        </w:rPr>
-      </w:pPr>
-      <w:bookmarkStart w:id="7" w:name="_Toc216620295"/>
-      <w:r>
-        <w:rPr>
-          <w:rFonts w:ascii="Arial" w:hAnsi="Arial" w:cs="Arial"/>
-          <w:color w:val="auto"/>
-        </w:rPr>
-        <w:t>Exploratory Data Analysis (EDA)</w:t>
-      </w:r>
-      <w:bookmarkEnd w:id="7"/>
-    </w:p>
-    <w:p>
-      <w:pPr>
-        <w:spacing w:after="120" w:line="360" w:lineRule="auto"/>
-        <w:jc w:val="both"/>
-        <w:rPr>
-          <w:rFonts w:ascii="Arial" w:hAnsi="Arial" w:cs="Arial"/>
-          <w:sz w:val="20"/>
-          <w:szCs w:val="20"/>
-        </w:rPr>
-      </w:pPr>
-      <w:r>
-        <w:tab/>
-      </w:r>
-      <w:r>
-        <w:rPr>
-          <w:rFonts w:ascii="Arial" w:hAnsi="Arial" w:cs="Arial"/>
-          <w:sz w:val="20"/>
-          <w:szCs w:val="20"/>
-        </w:rPr>
-        <w:t xml:space="preserve">Once the input dataset was considered, an EDA was conducted. Said analysis helps understanding the selected variables considering their </w:t>
-      </w:r>
-      <w:r>
-        <w:rPr>
-          <w:rFonts w:ascii="Arial" w:hAnsi="Arial" w:cs="Arial"/>
-          <w:sz w:val="20"/>
-          <w:szCs w:val="20"/>
-        </w:rPr>
-        <w:t xml:space="preserve">statistical properties, temporal behavior, and </w:t>
-      </w:r>
-      <w:r>
-        <w:rPr>
-          <w:rFonts w:ascii="Arial" w:hAnsi="Arial" w:cs="Arial"/>
-          <w:sz w:val="20"/>
-          <w:szCs w:val="20"/>
-        </w:rPr>
-        <w:t>cor</w:t>
-      </w:r>
-      <w:r>
-        <w:rPr>
-          <w:rFonts w:ascii="Arial" w:hAnsi="Arial" w:cs="Arial"/>
-          <w:sz w:val="20"/>
-          <w:szCs w:val="20"/>
-        </w:rPr>
-        <w:t>relation</w:t>
-      </w:r>
-      <w:r>
-        <w:rPr>
-          <w:rFonts w:ascii="Arial" w:hAnsi="Arial" w:cs="Arial"/>
-          <w:sz w:val="20"/>
-          <w:szCs w:val="20"/>
-        </w:rPr>
-        <w:t xml:space="preserve"> </w:t>
-      </w:r>
-      <w:r>
-        <w:rPr>
-          <w:rFonts w:ascii="Arial" w:hAnsi="Arial" w:cs="Arial"/>
-          <w:sz w:val="20"/>
-          <w:szCs w:val="20"/>
-        </w:rPr>
-        <w:t>between</w:t>
-      </w:r>
-      <w:r>
-        <w:rPr>
-          <w:rFonts w:ascii="Arial" w:hAnsi="Arial" w:cs="Arial"/>
-          <w:sz w:val="20"/>
-          <w:szCs w:val="20"/>
-        </w:rPr>
-        <w:t xml:space="preserve"> them and the target. </w:t>
-      </w:r>
-      <w:r>
-        <w:rPr>
-          <w:rFonts w:ascii="Arial" w:hAnsi="Arial" w:cs="Arial"/>
-          <w:sz w:val="20"/>
-          <w:szCs w:val="20"/>
-        </w:rPr>
-        <w:t xml:space="preserve">This step </w:t>
-      </w:r>
-      <w:r>
-        <w:rPr>
-          <w:rFonts w:ascii="Arial" w:hAnsi="Arial" w:cs="Arial"/>
-          <w:sz w:val="20"/>
-          <w:szCs w:val="20"/>
-        </w:rPr>
-        <w:t xml:space="preserve">helps to identify </w:t>
-      </w:r>
-      <w:r>
-        <w:rPr>
-          <w:rFonts w:ascii="Arial" w:hAnsi="Arial" w:cs="Arial"/>
-          <w:sz w:val="20"/>
-          <w:szCs w:val="20"/>
-        </w:rPr>
-        <w:t>anomalies,</w:t>
-      </w:r>
-      <w:r>
-        <w:rPr>
-          <w:rFonts w:ascii="Arial" w:hAnsi="Arial" w:cs="Arial"/>
-          <w:sz w:val="20"/>
-          <w:szCs w:val="20"/>
-        </w:rPr>
-        <w:t xml:space="preserve"> patterns</w:t>
-      </w:r>
-      <w:r>
-        <w:rPr>
-          <w:rFonts w:ascii="Arial" w:hAnsi="Arial" w:cs="Arial"/>
-          <w:sz w:val="20"/>
-          <w:szCs w:val="20"/>
-        </w:rPr>
-        <w:t xml:space="preserve"> and potential predictors prior to</w:t>
-      </w:r>
-      <w:r>
-        <w:rPr>
-          <w:rFonts w:ascii="Arial" w:hAnsi="Arial" w:cs="Arial"/>
-          <w:sz w:val="20"/>
-          <w:szCs w:val="20"/>
-        </w:rPr>
-        <w:t xml:space="preserve"> the </w:t>
-      </w:r>
-      <w:r>
-        <w:rPr>
-          <w:rFonts w:ascii="Arial" w:hAnsi="Arial" w:cs="Arial"/>
-          <w:sz w:val="20"/>
-          <w:szCs w:val="20"/>
-        </w:rPr>
-        <w:t>model development.</w:t>
+        <w:t>as well as time-series visualizations and a correlation analysis. All observations are later detailed in the “Findings” section</w:t>
+      </w:r>
+      <w:r>
+        <w:rPr>
+          <w:rFonts w:ascii="Arial" w:hAnsi="Arial" w:cs="Arial"/>
+          <w:sz w:val="20"/>
+          <w:szCs w:val="20"/>
+        </w:rPr>
+        <w:t xml:space="preserve">. </w:t>
+      </w:r>
+      <w:r>
+        <w:rPr>
+          <w:rFonts w:ascii="Arial" w:hAnsi="Arial" w:cs="Arial"/>
+          <w:sz w:val="20"/>
+          <w:szCs w:val="20"/>
+        </w:rPr>
+        <w:t>The EDA phase also included a systematic assessment of data quality. Missing values, zero entries, and potential anomalies were identified and quantified for each variable. While most missing values were limited in number, certain scheduled generation variables exhibited larger gaps, which were addressed during the preprocessing stage.</w:t>
       </w:r>
     </w:p>
     <w:p>
@@ -3635,48 +3694,69 @@
           <w:sz w:val="20"/>
           <w:szCs w:val="20"/>
         </w:rPr>
-        <w:t>Descriptive statistics were computed for all variables, including measures of central tendency, dispersion, skewness, and kurtosis</w:t>
-      </w:r>
-      <w:r>
-        <w:rPr>
-          <w:rFonts w:ascii="Arial" w:hAnsi="Arial" w:cs="Arial"/>
-          <w:sz w:val="20"/>
-          <w:szCs w:val="20"/>
-        </w:rPr>
-        <w:t>,</w:t>
-      </w:r>
-      <w:r>
-        <w:rPr>
-          <w:rFonts w:ascii="Arial" w:hAnsi="Arial" w:cs="Arial"/>
-          <w:sz w:val="20"/>
-          <w:szCs w:val="20"/>
-        </w:rPr>
-        <w:t xml:space="preserve"> </w:t>
-      </w:r>
-      <w:r>
-        <w:rPr>
-          <w:rFonts w:ascii="Arial" w:hAnsi="Arial" w:cs="Arial"/>
-          <w:sz w:val="20"/>
-          <w:szCs w:val="20"/>
-        </w:rPr>
-        <w:t>as well as time-series visualizations and a correlation analysis. All observations are later detailed in the “Findings” section</w:t>
-      </w:r>
-      <w:r>
-        <w:rPr>
-          <w:rFonts w:ascii="Arial" w:hAnsi="Arial" w:cs="Arial"/>
-          <w:sz w:val="20"/>
-          <w:szCs w:val="20"/>
-        </w:rPr>
-        <w:t xml:space="preserve">. </w:t>
-      </w:r>
-      <w:r>
-        <w:rPr>
-          <w:rFonts w:ascii="Arial" w:hAnsi="Arial" w:cs="Arial"/>
-          <w:sz w:val="20"/>
-          <w:szCs w:val="20"/>
-        </w:rPr>
-        <w:t>The EDA phase also included a systematic assessment of data quality. Missing values, zero entries, and potential anomalies were identified and quantified for each variable. While most missing values were limited in number, certain scheduled generation variables exhibited larger gaps, which were addressed during the preprocessing stage.</w:t>
-      </w:r>
+        <w:t xml:space="preserve">The insights obtained from the </w:t>
+      </w:r>
+      <w:r>
+        <w:rPr>
+          <w:rFonts w:ascii="Arial" w:hAnsi="Arial" w:cs="Arial"/>
+          <w:sz w:val="20"/>
+          <w:szCs w:val="20"/>
+        </w:rPr>
+        <w:t xml:space="preserve">exploratory data analysis were greatly considered for the </w:t>
+      </w:r>
+      <w:proofErr w:type="spellStart"/>
+      <w:r>
+        <w:rPr>
+          <w:rFonts w:ascii="Arial" w:hAnsi="Arial" w:cs="Arial"/>
+          <w:sz w:val="20"/>
+          <w:szCs w:val="20"/>
+        </w:rPr>
+        <w:t>the</w:t>
+      </w:r>
+      <w:proofErr w:type="spellEnd"/>
+      <w:r>
+        <w:rPr>
+          <w:rFonts w:ascii="Arial" w:hAnsi="Arial" w:cs="Arial"/>
+          <w:sz w:val="20"/>
+          <w:szCs w:val="20"/>
+        </w:rPr>
+        <w:t xml:space="preserve"> subsequent </w:t>
+      </w:r>
+      <w:r>
+        <w:rPr>
+          <w:rFonts w:ascii="Arial" w:hAnsi="Arial" w:cs="Arial"/>
+          <w:sz w:val="20"/>
+          <w:szCs w:val="20"/>
+        </w:rPr>
+        <w:t xml:space="preserve">feature selection and </w:t>
+      </w:r>
+      <w:r>
+        <w:rPr>
+          <w:rFonts w:ascii="Arial" w:hAnsi="Arial" w:cs="Arial"/>
+          <w:sz w:val="20"/>
+          <w:szCs w:val="20"/>
+        </w:rPr>
+        <w:t>modelling steps.</w:t>
+      </w:r>
+    </w:p>
+    <w:p>
+      <w:pPr>
+        <w:pStyle w:val="Heading2"/>
+        <w:ind w:firstLine="357"/>
+        <w:rPr>
+          <w:rFonts w:ascii="Arial" w:hAnsi="Arial" w:cs="Arial"/>
+          <w:color w:val="auto"/>
+        </w:rPr>
+      </w:pPr>
+      <w:bookmarkStart w:id="9" w:name="_Toc216620296"/>
+      <w:r>
+        <w:rPr>
+          <w:rFonts w:ascii="Arial" w:hAnsi="Arial" w:cs="Arial"/>
+          <w:color w:val="auto"/>
+        </w:rPr>
+        <w:t>Feature engineering and selection</w:t>
+      </w:r>
+      <w:bookmarkEnd w:id="9"/>
     </w:p>
     <w:p>
       <w:pPr>
@@ -3695,67 +3775,7 @@
           <w:sz w:val="20"/>
           <w:szCs w:val="20"/>
         </w:rPr>
-        <w:t xml:space="preserve">The insights obtained from the </w:t>
-      </w:r>
-      <w:r>
-        <w:rPr>
-          <w:rFonts w:ascii="Arial" w:hAnsi="Arial" w:cs="Arial"/>
-          <w:sz w:val="20"/>
-          <w:szCs w:val="20"/>
-        </w:rPr>
-        <w:t xml:space="preserve">exploratory data analysis were greatly considered for </w:t>
-      </w:r>
-      <w:proofErr w:type="gramStart"/>
-      <w:r>
-        <w:rPr>
-          <w:rFonts w:ascii="Arial" w:hAnsi="Arial" w:cs="Arial"/>
-          <w:sz w:val="20"/>
-          <w:szCs w:val="20"/>
-        </w:rPr>
-        <w:t xml:space="preserve">the </w:t>
-      </w:r>
-      <w:proofErr w:type="spellStart"/>
-      <w:r>
-        <w:rPr>
-          <w:rFonts w:ascii="Arial" w:hAnsi="Arial" w:cs="Arial"/>
-          <w:sz w:val="20"/>
-          <w:szCs w:val="20"/>
-        </w:rPr>
-        <w:t>the</w:t>
-      </w:r>
-      <w:proofErr w:type="spellEnd"/>
-      <w:proofErr w:type="gramEnd"/>
-      <w:r>
-        <w:rPr>
-          <w:rFonts w:ascii="Arial" w:hAnsi="Arial" w:cs="Arial"/>
-          <w:sz w:val="20"/>
-          <w:szCs w:val="20"/>
-        </w:rPr>
-        <w:t xml:space="preserve"> subsequent </w:t>
-      </w:r>
-      <w:r>
-        <w:rPr>
-          <w:rFonts w:ascii="Arial" w:hAnsi="Arial" w:cs="Arial"/>
-          <w:sz w:val="20"/>
-          <w:szCs w:val="20"/>
-        </w:rPr>
-        <w:t xml:space="preserve">feature selection and </w:t>
-      </w:r>
-      <w:r>
-        <w:rPr>
-          <w:rFonts w:ascii="Arial" w:hAnsi="Arial" w:cs="Arial"/>
-          <w:sz w:val="20"/>
-          <w:szCs w:val="20"/>
-        </w:rPr>
-        <w:t xml:space="preserve">modelling steps. The strong temporal structure and autocorrelation of prices justified the use of lagged </w:t>
-      </w:r>
-      <w:r>
-        <w:rPr>
-          <w:rFonts w:ascii="Arial" w:hAnsi="Arial" w:cs="Arial"/>
-          <w:sz w:val="20"/>
-          <w:szCs w:val="20"/>
-        </w:rPr>
-        <w:t>features,</w:t>
+        <w:t>The strong temporal structure and autocorrelation of prices justified the use of lagged features,</w:t>
       </w:r>
       <w:r>
         <w:rPr>
@@ -3788,26 +3808,141 @@
           <w:szCs w:val="20"/>
         </w:rPr>
         <w:t>.</w:t>
+      </w:r>
+      <w:r>
+        <w:t xml:space="preserve"> </w:t>
+      </w:r>
+      <w:r>
+        <w:rPr>
+          <w:rFonts w:ascii="Arial" w:hAnsi="Arial" w:cs="Arial"/>
+          <w:sz w:val="20"/>
+          <w:szCs w:val="20"/>
+        </w:rPr>
+        <w:t>The construction of lagged features (up to 336 hours) introduced missing values at the beginning of the dataset. These observations were removed to ensure that all samples used for modelling contain complete information.</w:t>
       </w:r>
     </w:p>
     <w:p>
       <w:pPr>
-        <w:pStyle w:val="Heading2"/>
-        <w:ind w:firstLine="357"/>
-        <w:rPr>
-          <w:rFonts w:ascii="Arial" w:hAnsi="Arial" w:cs="Arial"/>
-          <w:color w:val="auto"/>
-        </w:rPr>
-      </w:pPr>
-      <w:bookmarkStart w:id="8" w:name="_Toc216620296"/>
-      <w:r>
-        <w:rPr>
-          <w:rFonts w:ascii="Arial" w:hAnsi="Arial" w:cs="Arial"/>
-          <w:color w:val="auto"/>
-        </w:rPr>
-        <w:t>Feature engineering and selection</w:t>
-      </w:r>
-      <w:bookmarkEnd w:id="8"/>
+        <w:spacing w:after="120" w:line="360" w:lineRule="auto"/>
+        <w:jc w:val="both"/>
+        <w:rPr>
+          <w:rFonts w:ascii="Arial" w:hAnsi="Arial" w:cs="Arial"/>
+          <w:sz w:val="20"/>
+          <w:szCs w:val="20"/>
+        </w:rPr>
+      </w:pPr>
+      <w:r>
+        <w:rPr>
+          <w:rFonts w:ascii="Arial" w:hAnsi="Arial" w:cs="Arial"/>
+          <w:sz w:val="20"/>
+          <w:szCs w:val="20"/>
+        </w:rPr>
+        <w:t xml:space="preserve">Feature engineering and selection play a central role in the development of an accurate and meaningful </w:t>
+      </w:r>
+      <w:r>
+        <w:rPr>
+          <w:rFonts w:ascii="Arial" w:hAnsi="Arial" w:cs="Arial"/>
+          <w:sz w:val="20"/>
+          <w:szCs w:val="20"/>
+        </w:rPr>
+        <w:t xml:space="preserve">SPOT </w:t>
+      </w:r>
+      <w:r>
+        <w:rPr>
+          <w:rFonts w:ascii="Arial" w:hAnsi="Arial" w:cs="Arial"/>
+          <w:sz w:val="20"/>
+          <w:szCs w:val="20"/>
+        </w:rPr>
+        <w:t xml:space="preserve">price forecasting model. </w:t>
+      </w:r>
+      <w:r>
+        <w:rPr>
+          <w:rFonts w:ascii="Arial" w:hAnsi="Arial" w:cs="Arial"/>
+          <w:sz w:val="20"/>
+          <w:szCs w:val="20"/>
+        </w:rPr>
+        <w:t>T</w:t>
+      </w:r>
+      <w:r>
+        <w:rPr>
+          <w:rFonts w:ascii="Arial" w:hAnsi="Arial" w:cs="Arial"/>
+          <w:sz w:val="20"/>
+          <w:szCs w:val="20"/>
+        </w:rPr>
+        <w:t xml:space="preserve">he process was guided by </w:t>
+      </w:r>
+      <w:r>
+        <w:rPr>
+          <w:rFonts w:ascii="Arial" w:hAnsi="Arial" w:cs="Arial"/>
+          <w:sz w:val="20"/>
+          <w:szCs w:val="20"/>
+        </w:rPr>
+        <w:t>the</w:t>
+      </w:r>
+      <w:r>
+        <w:rPr>
+          <w:rFonts w:ascii="Arial" w:hAnsi="Arial" w:cs="Arial"/>
+          <w:sz w:val="20"/>
+          <w:szCs w:val="20"/>
+        </w:rPr>
+        <w:t xml:space="preserve"> </w:t>
+      </w:r>
+      <w:r>
+        <w:rPr>
+          <w:rFonts w:ascii="Arial" w:hAnsi="Arial" w:cs="Arial"/>
+          <w:sz w:val="20"/>
+          <w:szCs w:val="20"/>
+        </w:rPr>
+        <w:t>statistical analysis</w:t>
+      </w:r>
+      <w:r>
+        <w:rPr>
+          <w:rFonts w:ascii="Arial" w:hAnsi="Arial" w:cs="Arial"/>
+          <w:sz w:val="20"/>
+          <w:szCs w:val="20"/>
+        </w:rPr>
+        <w:t xml:space="preserve"> made during the EDA section</w:t>
+      </w:r>
+      <w:r>
+        <w:rPr>
+          <w:rFonts w:ascii="Arial" w:hAnsi="Arial" w:cs="Arial"/>
+          <w:sz w:val="20"/>
+          <w:szCs w:val="20"/>
+        </w:rPr>
+        <w:t xml:space="preserve">, </w:t>
+      </w:r>
+      <w:r>
+        <w:rPr>
+          <w:rFonts w:ascii="Arial" w:hAnsi="Arial" w:cs="Arial"/>
+          <w:sz w:val="20"/>
+          <w:szCs w:val="20"/>
+        </w:rPr>
+        <w:t xml:space="preserve">and constraints from the </w:t>
+      </w:r>
+      <w:r>
+        <w:rPr>
+          <w:rFonts w:ascii="Arial" w:hAnsi="Arial" w:cs="Arial"/>
+          <w:sz w:val="20"/>
+          <w:szCs w:val="20"/>
+        </w:rPr>
+        <w:t>electricity market operation</w:t>
+      </w:r>
+      <w:r>
+        <w:rPr>
+          <w:rFonts w:ascii="Arial" w:hAnsi="Arial" w:cs="Arial"/>
+          <w:sz w:val="20"/>
+          <w:szCs w:val="20"/>
+        </w:rPr>
+        <w:t xml:space="preserve"> </w:t>
+      </w:r>
+      <w:r>
+        <w:rPr>
+          <w:rFonts w:ascii="Arial" w:hAnsi="Arial" w:cs="Arial"/>
+          <w:sz w:val="20"/>
+          <w:szCs w:val="20"/>
+        </w:rPr>
+        <w:t>and data leakage prevention.</w:t>
+      </w:r>
     </w:p>
     <w:p>
       <w:pPr>
@@ -3826,137 +3961,24 @@
           <w:sz w:val="20"/>
           <w:szCs w:val="20"/>
         </w:rPr>
-        <w:t xml:space="preserve">Feature engineering and selection play a central role in the development of an accurate and meaningful </w:t>
-      </w:r>
-      <w:r>
-        <w:rPr>
-          <w:rFonts w:ascii="Arial" w:hAnsi="Arial" w:cs="Arial"/>
-          <w:sz w:val="20"/>
-          <w:szCs w:val="20"/>
-        </w:rPr>
-        <w:t xml:space="preserve">SPOT </w:t>
-      </w:r>
-      <w:r>
-        <w:rPr>
-          <w:rFonts w:ascii="Arial" w:hAnsi="Arial" w:cs="Arial"/>
-          <w:sz w:val="20"/>
-          <w:szCs w:val="20"/>
-        </w:rPr>
-        <w:t xml:space="preserve">price forecasting model. </w:t>
-      </w:r>
-      <w:r>
-        <w:rPr>
-          <w:rFonts w:ascii="Arial" w:hAnsi="Arial" w:cs="Arial"/>
-          <w:sz w:val="20"/>
-          <w:szCs w:val="20"/>
-        </w:rPr>
-        <w:t>T</w:t>
-      </w:r>
-      <w:r>
-        <w:rPr>
-          <w:rFonts w:ascii="Arial" w:hAnsi="Arial" w:cs="Arial"/>
-          <w:sz w:val="20"/>
-          <w:szCs w:val="20"/>
-        </w:rPr>
-        <w:t xml:space="preserve">he process was guided by </w:t>
-      </w:r>
-      <w:proofErr w:type="gramStart"/>
-      <w:r>
-        <w:rPr>
-          <w:rFonts w:ascii="Arial" w:hAnsi="Arial" w:cs="Arial"/>
-          <w:sz w:val="20"/>
-          <w:szCs w:val="20"/>
-        </w:rPr>
-        <w:t xml:space="preserve">a </w:t>
-      </w:r>
-      <w:r>
-        <w:rPr>
-          <w:rFonts w:ascii="Arial" w:hAnsi="Arial" w:cs="Arial"/>
-          <w:sz w:val="20"/>
-          <w:szCs w:val="20"/>
-        </w:rPr>
-        <w:t>the</w:t>
-      </w:r>
-      <w:proofErr w:type="gramEnd"/>
-      <w:r>
-        <w:rPr>
-          <w:rFonts w:ascii="Arial" w:hAnsi="Arial" w:cs="Arial"/>
-          <w:sz w:val="20"/>
-          <w:szCs w:val="20"/>
-        </w:rPr>
-        <w:t xml:space="preserve"> </w:t>
-      </w:r>
-      <w:r>
-        <w:rPr>
-          <w:rFonts w:ascii="Arial" w:hAnsi="Arial" w:cs="Arial"/>
-          <w:sz w:val="20"/>
-          <w:szCs w:val="20"/>
-        </w:rPr>
-        <w:t>statistical analysis</w:t>
-      </w:r>
-      <w:r>
-        <w:rPr>
-          <w:rFonts w:ascii="Arial" w:hAnsi="Arial" w:cs="Arial"/>
-          <w:sz w:val="20"/>
-          <w:szCs w:val="20"/>
-        </w:rPr>
-        <w:t xml:space="preserve"> made during the EDA section</w:t>
-      </w:r>
-      <w:r>
-        <w:rPr>
-          <w:rFonts w:ascii="Arial" w:hAnsi="Arial" w:cs="Arial"/>
-          <w:sz w:val="20"/>
-          <w:szCs w:val="20"/>
-        </w:rPr>
-        <w:t xml:space="preserve">, </w:t>
-      </w:r>
-      <w:r>
-        <w:rPr>
-          <w:rFonts w:ascii="Arial" w:hAnsi="Arial" w:cs="Arial"/>
-          <w:sz w:val="20"/>
-          <w:szCs w:val="20"/>
-        </w:rPr>
-        <w:t xml:space="preserve">and constraints from the </w:t>
-      </w:r>
-      <w:r>
-        <w:rPr>
-          <w:rFonts w:ascii="Arial" w:hAnsi="Arial" w:cs="Arial"/>
-          <w:sz w:val="20"/>
-          <w:szCs w:val="20"/>
-        </w:rPr>
-        <w:t>electricity market operation</w:t>
-      </w:r>
-      <w:r>
-        <w:rPr>
-          <w:rFonts w:ascii="Arial" w:hAnsi="Arial" w:cs="Arial"/>
-          <w:sz w:val="20"/>
-          <w:szCs w:val="20"/>
-        </w:rPr>
-        <w:t xml:space="preserve"> </w:t>
-      </w:r>
-      <w:r>
-        <w:rPr>
-          <w:rFonts w:ascii="Arial" w:hAnsi="Arial" w:cs="Arial"/>
-          <w:sz w:val="20"/>
-          <w:szCs w:val="20"/>
-        </w:rPr>
-        <w:t>and data leakage</w:t>
-      </w:r>
-      <w:r>
-        <w:rPr>
-          <w:rFonts w:ascii="Arial" w:hAnsi="Arial" w:cs="Arial"/>
-          <w:sz w:val="20"/>
-          <w:szCs w:val="20"/>
-        </w:rPr>
-        <w:t xml:space="preserve"> </w:t>
-      </w:r>
-      <w:r>
-        <w:rPr>
-          <w:rFonts w:ascii="Arial" w:hAnsi="Arial" w:cs="Arial"/>
-          <w:sz w:val="20"/>
-          <w:szCs w:val="20"/>
-        </w:rPr>
-        <w:t>prevention.</w:t>
+        <w:lastRenderedPageBreak/>
+        <w:t>The p</w:t>
+      </w:r>
+      <w:r>
+        <w:rPr>
+          <w:rFonts w:ascii="Arial" w:hAnsi="Arial" w:cs="Arial"/>
+          <w:sz w:val="20"/>
+          <w:szCs w:val="20"/>
+        </w:rPr>
+        <w:t xml:space="preserve">roblem is defined as </w:t>
+      </w:r>
+      <w:r>
+        <w:rPr>
+          <w:rFonts w:ascii="Arial" w:hAnsi="Arial" w:cs="Arial"/>
+          <w:sz w:val="20"/>
+          <w:szCs w:val="20"/>
+        </w:rPr>
+        <w:t xml:space="preserve">follows: </w:t>
       </w:r>
     </w:p>
     <w:p>
@@ -3966,33 +3988,51 @@
         <w:jc w:val="both"/>
         <w:rPr>
           <w:rFonts w:ascii="Arial" w:hAnsi="Arial" w:cs="Arial"/>
-          <w:sz w:val="20"/>
-          <w:szCs w:val="20"/>
-        </w:rPr>
-      </w:pPr>
-      <w:r>
-        <w:rPr>
-          <w:rFonts w:ascii="Arial" w:hAnsi="Arial" w:cs="Arial"/>
-          <w:sz w:val="20"/>
-          <w:szCs w:val="20"/>
-        </w:rPr>
-        <w:t>The p</w:t>
-      </w:r>
-      <w:r>
-        <w:rPr>
-          <w:rFonts w:ascii="Arial" w:hAnsi="Arial" w:cs="Arial"/>
-          <w:sz w:val="20"/>
-          <w:szCs w:val="20"/>
-        </w:rPr>
-        <w:t xml:space="preserve">roblem is defined as </w:t>
-      </w:r>
-      <w:r>
-        <w:rPr>
-          <w:rFonts w:ascii="Arial" w:hAnsi="Arial" w:cs="Arial"/>
-          <w:sz w:val="20"/>
-          <w:szCs w:val="20"/>
-        </w:rPr>
-        <w:t xml:space="preserve">follows: </w:t>
+          <w:i/>
+          <w:iCs/>
+          <w:sz w:val="20"/>
+          <w:szCs w:val="20"/>
+        </w:rPr>
+      </w:pPr>
+      <w:r>
+        <w:rPr>
+          <w:rFonts w:ascii="Arial" w:hAnsi="Arial" w:cs="Arial"/>
+          <w:i/>
+          <w:iCs/>
+          <w:sz w:val="20"/>
+          <w:szCs w:val="20"/>
+        </w:rPr>
+        <w:t>G</w:t>
+      </w:r>
+      <w:r>
+        <w:rPr>
+          <w:rFonts w:ascii="Arial" w:hAnsi="Arial" w:cs="Arial"/>
+          <w:i/>
+          <w:iCs/>
+          <w:sz w:val="20"/>
+          <w:szCs w:val="20"/>
+        </w:rPr>
+        <w:t>iven information available on day D</w:t>
+      </w:r>
+      <w:r>
+        <w:rPr>
+          <w:rFonts w:ascii="Arial" w:hAnsi="Arial" w:cs="Arial"/>
+          <w:i/>
+          <w:iCs/>
+          <w:sz w:val="20"/>
+          <w:szCs w:val="20"/>
+        </w:rPr>
+        <w:t xml:space="preserve"> at the time the daily spot electricity market closes</w:t>
+      </w:r>
+      <w:r>
+        <w:rPr>
+          <w:rFonts w:ascii="Arial" w:hAnsi="Arial" w:cs="Arial"/>
+          <w:i/>
+          <w:iCs/>
+          <w:sz w:val="20"/>
+          <w:szCs w:val="20"/>
+        </w:rPr>
+        <w:t>, predict the hourly day-ahead marginal electricity prices for day D+1 in the Spanish wholesale market.</w:t>
       </w:r>
     </w:p>
     <w:p>
@@ -4002,71 +4042,49 @@
         <w:jc w:val="both"/>
         <w:rPr>
           <w:rFonts w:ascii="Arial" w:hAnsi="Arial" w:cs="Arial"/>
-          <w:i/>
-          <w:iCs/>
-          <w:sz w:val="20"/>
-          <w:szCs w:val="20"/>
-        </w:rPr>
-      </w:pPr>
-      <w:r>
-        <w:rPr>
-          <w:rFonts w:ascii="Arial" w:hAnsi="Arial" w:cs="Arial"/>
-          <w:i/>
-          <w:iCs/>
-          <w:sz w:val="20"/>
-          <w:szCs w:val="20"/>
-        </w:rPr>
-        <w:t>G</w:t>
-      </w:r>
-      <w:r>
-        <w:rPr>
-          <w:rFonts w:ascii="Arial" w:hAnsi="Arial" w:cs="Arial"/>
-          <w:i/>
-          <w:iCs/>
-          <w:sz w:val="20"/>
-          <w:szCs w:val="20"/>
-        </w:rPr>
-        <w:t>iven information available on day D</w:t>
-      </w:r>
-      <w:r>
-        <w:rPr>
-          <w:rFonts w:ascii="Arial" w:hAnsi="Arial" w:cs="Arial"/>
-          <w:i/>
-          <w:iCs/>
-          <w:sz w:val="20"/>
-          <w:szCs w:val="20"/>
-        </w:rPr>
-        <w:t xml:space="preserve"> at the time the daily spot electricity market closes</w:t>
-      </w:r>
-      <w:r>
-        <w:rPr>
-          <w:rFonts w:ascii="Arial" w:hAnsi="Arial" w:cs="Arial"/>
-          <w:i/>
-          <w:iCs/>
-          <w:sz w:val="20"/>
-          <w:szCs w:val="20"/>
-        </w:rPr>
-        <w:t>, predict the hourly day-ahead marginal electricity prices for day D</w:t>
-      </w:r>
-      <w:r>
-        <w:rPr>
-          <w:rFonts w:ascii="Arial" w:hAnsi="Arial" w:cs="Arial"/>
-          <w:i/>
-          <w:iCs/>
-          <w:sz w:val="20"/>
-          <w:szCs w:val="20"/>
-        </w:rPr>
-        <w:t>+1</w:t>
-      </w:r>
-      <w:r>
-        <w:rPr>
-          <w:rFonts w:ascii="Arial" w:hAnsi="Arial" w:cs="Arial"/>
-          <w:i/>
-          <w:iCs/>
-          <w:sz w:val="20"/>
-          <w:szCs w:val="20"/>
-        </w:rPr>
-        <w:t xml:space="preserve"> in the Spanish wholesale market.</w:t>
+          <w:sz w:val="20"/>
+          <w:szCs w:val="20"/>
+        </w:rPr>
+      </w:pPr>
+      <w:r>
+        <w:rPr>
+          <w:rFonts w:ascii="Arial" w:hAnsi="Arial" w:cs="Arial"/>
+          <w:sz w:val="20"/>
+          <w:szCs w:val="20"/>
+        </w:rPr>
+        <w:t xml:space="preserve">Therefore, only variables that are available before D-day at 12:00 are permitted. To ensure validity, all </w:t>
+      </w:r>
+      <w:r>
+        <w:rPr>
+          <w:rFonts w:ascii="Arial" w:hAnsi="Arial" w:cs="Arial"/>
+          <w:sz w:val="20"/>
+          <w:szCs w:val="20"/>
+        </w:rPr>
+        <w:t xml:space="preserve">the </w:t>
+      </w:r>
+      <w:r>
+        <w:rPr>
+          <w:rFonts w:ascii="Arial" w:hAnsi="Arial" w:cs="Arial"/>
+          <w:sz w:val="20"/>
+          <w:szCs w:val="20"/>
+        </w:rPr>
+        <w:t>post-event variables such as actual generation were excluded from the modelling framework, as their inclusion would introduce data leakage and artificially inflate</w:t>
+      </w:r>
+      <w:r>
+        <w:rPr>
+          <w:rFonts w:ascii="Arial" w:hAnsi="Arial" w:cs="Arial"/>
+          <w:sz w:val="20"/>
+          <w:szCs w:val="20"/>
+        </w:rPr>
+        <w:t xml:space="preserve"> the</w:t>
+      </w:r>
+      <w:r>
+        <w:rPr>
+          <w:rFonts w:ascii="Arial" w:hAnsi="Arial" w:cs="Arial"/>
+          <w:sz w:val="20"/>
+          <w:szCs w:val="20"/>
+        </w:rPr>
+        <w:t xml:space="preserve"> model performance.</w:t>
       </w:r>
     </w:p>
     <w:p>
@@ -4086,39 +4104,169 @@
           <w:sz w:val="20"/>
           <w:szCs w:val="20"/>
         </w:rPr>
-        <w:t xml:space="preserve">Therefore, only variables that are available before D-day at 12:00 are permitted. To ensure validity, all </w:t>
-      </w:r>
-      <w:r>
-        <w:rPr>
-          <w:rFonts w:ascii="Arial" w:hAnsi="Arial" w:cs="Arial"/>
-          <w:sz w:val="20"/>
-          <w:szCs w:val="20"/>
-        </w:rPr>
-        <w:t xml:space="preserve">the </w:t>
-      </w:r>
-      <w:r>
-        <w:rPr>
-          <w:rFonts w:ascii="Arial" w:hAnsi="Arial" w:cs="Arial"/>
-          <w:sz w:val="20"/>
-          <w:szCs w:val="20"/>
-        </w:rPr>
-        <w:t>post-event variables such as actual generation were excluded from the modelling framework, as their inclusion would introduce data leakage and artificially inflate</w:t>
-      </w:r>
-      <w:r>
-        <w:rPr>
-          <w:rFonts w:ascii="Arial" w:hAnsi="Arial" w:cs="Arial"/>
-          <w:sz w:val="20"/>
-          <w:szCs w:val="20"/>
-        </w:rPr>
-        <w:t xml:space="preserve"> the</w:t>
-      </w:r>
-      <w:r>
-        <w:rPr>
-          <w:rFonts w:ascii="Arial" w:hAnsi="Arial" w:cs="Arial"/>
-          <w:sz w:val="20"/>
-          <w:szCs w:val="20"/>
-        </w:rPr>
-        <w:t xml:space="preserve"> model performance.</w:t>
+        <w:t>Given that e</w:t>
+      </w:r>
+      <w:r>
+        <w:rPr>
+          <w:rFonts w:ascii="Arial" w:hAnsi="Arial" w:cs="Arial"/>
+          <w:sz w:val="20"/>
+          <w:szCs w:val="20"/>
+        </w:rPr>
+        <w:t xml:space="preserve">lectricity </w:t>
+      </w:r>
+      <w:r>
+        <w:rPr>
+          <w:rFonts w:ascii="Arial" w:hAnsi="Arial" w:cs="Arial"/>
+          <w:sz w:val="20"/>
+          <w:szCs w:val="20"/>
+        </w:rPr>
+        <w:t>prices</w:t>
+      </w:r>
+      <w:r>
+        <w:rPr>
+          <w:rFonts w:ascii="Arial" w:hAnsi="Arial" w:cs="Arial"/>
+          <w:sz w:val="20"/>
+          <w:szCs w:val="20"/>
+        </w:rPr>
+        <w:t xml:space="preserve"> show</w:t>
+      </w:r>
+      <w:r>
+        <w:rPr>
+          <w:rFonts w:ascii="Arial" w:hAnsi="Arial" w:cs="Arial"/>
+          <w:sz w:val="20"/>
+          <w:szCs w:val="20"/>
+        </w:rPr>
+        <w:t xml:space="preserve"> </w:t>
+      </w:r>
+      <w:r>
+        <w:rPr>
+          <w:rFonts w:ascii="Arial" w:hAnsi="Arial" w:cs="Arial"/>
+          <w:sz w:val="20"/>
+          <w:szCs w:val="20"/>
+        </w:rPr>
+        <w:t xml:space="preserve">a </w:t>
+      </w:r>
+      <w:r>
+        <w:rPr>
+          <w:rFonts w:ascii="Arial" w:hAnsi="Arial" w:cs="Arial"/>
+          <w:sz w:val="20"/>
+          <w:szCs w:val="20"/>
+        </w:rPr>
+        <w:t>strong t</w:t>
+      </w:r>
+      <w:r>
+        <w:rPr>
+          <w:rFonts w:ascii="Arial" w:hAnsi="Arial" w:cs="Arial"/>
+          <w:sz w:val="20"/>
+          <w:szCs w:val="20"/>
+        </w:rPr>
+        <w:t xml:space="preserve">ime </w:t>
+      </w:r>
+      <w:r>
+        <w:rPr>
+          <w:rFonts w:ascii="Arial" w:hAnsi="Arial" w:cs="Arial"/>
+          <w:sz w:val="20"/>
+          <w:szCs w:val="20"/>
+        </w:rPr>
+        <w:t xml:space="preserve">dependence </w:t>
+      </w:r>
+      <w:r>
+        <w:rPr>
+          <w:rFonts w:ascii="Arial" w:hAnsi="Arial" w:cs="Arial"/>
+          <w:sz w:val="20"/>
+          <w:szCs w:val="20"/>
+        </w:rPr>
+        <w:t xml:space="preserve">because of </w:t>
+      </w:r>
+      <w:r>
+        <w:rPr>
+          <w:rFonts w:ascii="Arial" w:hAnsi="Arial" w:cs="Arial"/>
+          <w:sz w:val="20"/>
+          <w:szCs w:val="20"/>
+        </w:rPr>
+        <w:t xml:space="preserve">demand inertia, </w:t>
+      </w:r>
+      <w:proofErr w:type="spellStart"/>
+      <w:r>
+        <w:rPr>
+          <w:rFonts w:ascii="Arial" w:hAnsi="Arial" w:cs="Arial"/>
+          <w:sz w:val="20"/>
+          <w:szCs w:val="20"/>
+        </w:rPr>
+        <w:t>pwer</w:t>
+      </w:r>
+      <w:proofErr w:type="spellEnd"/>
+      <w:r>
+        <w:rPr>
+          <w:rFonts w:ascii="Arial" w:hAnsi="Arial" w:cs="Arial"/>
+          <w:sz w:val="20"/>
+          <w:szCs w:val="20"/>
+        </w:rPr>
+        <w:t xml:space="preserve"> </w:t>
+      </w:r>
+      <w:r>
+        <w:rPr>
+          <w:rFonts w:ascii="Arial" w:hAnsi="Arial" w:cs="Arial"/>
+          <w:sz w:val="20"/>
+          <w:szCs w:val="20"/>
+        </w:rPr>
+        <w:t>generation scheduling, and market mechanisms</w:t>
+      </w:r>
+      <w:r>
+        <w:rPr>
+          <w:rFonts w:ascii="Arial" w:hAnsi="Arial" w:cs="Arial"/>
+          <w:sz w:val="20"/>
+          <w:szCs w:val="20"/>
+        </w:rPr>
+        <w:t xml:space="preserve">, </w:t>
+      </w:r>
+      <w:r>
+        <w:rPr>
+          <w:rFonts w:ascii="Arial" w:hAnsi="Arial" w:cs="Arial"/>
+          <w:sz w:val="20"/>
+          <w:szCs w:val="20"/>
+        </w:rPr>
+        <w:t xml:space="preserve">several lagged features were </w:t>
+      </w:r>
+      <w:r>
+        <w:rPr>
+          <w:rFonts w:ascii="Arial" w:hAnsi="Arial" w:cs="Arial"/>
+          <w:sz w:val="20"/>
+          <w:szCs w:val="20"/>
+        </w:rPr>
+        <w:t>designed</w:t>
+      </w:r>
+      <w:r>
+        <w:rPr>
+          <w:rFonts w:ascii="Arial" w:hAnsi="Arial" w:cs="Arial"/>
+          <w:sz w:val="20"/>
+          <w:szCs w:val="20"/>
+        </w:rPr>
+        <w:t xml:space="preserve"> </w:t>
+      </w:r>
+      <w:r>
+        <w:rPr>
+          <w:rFonts w:ascii="Arial" w:hAnsi="Arial" w:cs="Arial"/>
+          <w:sz w:val="20"/>
+          <w:szCs w:val="20"/>
+        </w:rPr>
+        <w:t>capturing short-</w:t>
+      </w:r>
+      <w:r>
+        <w:rPr>
+          <w:rFonts w:ascii="Arial" w:hAnsi="Arial" w:cs="Arial"/>
+          <w:sz w:val="20"/>
+          <w:szCs w:val="20"/>
+        </w:rPr>
+        <w:t>term</w:t>
+      </w:r>
+      <w:r>
+        <w:rPr>
+          <w:rFonts w:ascii="Arial" w:hAnsi="Arial" w:cs="Arial"/>
+          <w:sz w:val="20"/>
+          <w:szCs w:val="20"/>
+        </w:rPr>
+        <w:t xml:space="preserve"> and medium-term dynamics.</w:t>
       </w:r>
     </w:p>
     <w:p>
@@ -4138,31 +4286,40 @@
           <w:sz w:val="20"/>
           <w:szCs w:val="20"/>
         </w:rPr>
-        <w:t>Given that e</w:t>
-      </w:r>
-      <w:r>
-        <w:rPr>
-          <w:rFonts w:ascii="Arial" w:hAnsi="Arial" w:cs="Arial"/>
-          <w:sz w:val="20"/>
-          <w:szCs w:val="20"/>
-        </w:rPr>
-        <w:t xml:space="preserve">lectricity </w:t>
-      </w:r>
-      <w:r>
-        <w:rPr>
-          <w:rFonts w:ascii="Arial" w:hAnsi="Arial" w:cs="Arial"/>
-          <w:sz w:val="20"/>
-          <w:szCs w:val="20"/>
-        </w:rPr>
-        <w:t>prices</w:t>
-      </w:r>
-      <w:r>
-        <w:rPr>
-          <w:rFonts w:ascii="Arial" w:hAnsi="Arial" w:cs="Arial"/>
-          <w:sz w:val="20"/>
-          <w:szCs w:val="20"/>
-        </w:rPr>
-        <w:t xml:space="preserve"> show</w:t>
+        <w:t>Lagged prices:</w:t>
+      </w:r>
+      <w:r>
+        <w:rPr>
+          <w:rFonts w:ascii="Arial" w:hAnsi="Arial" w:cs="Arial"/>
+          <w:sz w:val="20"/>
+          <w:szCs w:val="20"/>
+        </w:rPr>
+        <w:t xml:space="preserve"> P</w:t>
+      </w:r>
+      <w:r>
+        <w:rPr>
+          <w:rFonts w:ascii="Arial" w:hAnsi="Arial" w:cs="Arial"/>
+          <w:sz w:val="20"/>
+          <w:szCs w:val="20"/>
+        </w:rPr>
+        <w:t>rice</w:t>
+      </w:r>
+      <w:r>
+        <w:rPr>
+          <w:rFonts w:ascii="Arial" w:hAnsi="Arial" w:cs="Arial"/>
+          <w:sz w:val="20"/>
+          <w:szCs w:val="20"/>
+          <w:vertAlign w:val="subscript"/>
+        </w:rPr>
+        <w:t>24</w:t>
+      </w:r>
+      <w:r>
+        <w:rPr>
+          <w:rFonts w:ascii="Arial" w:hAnsi="Arial" w:cs="Arial"/>
+          <w:sz w:val="20"/>
+          <w:szCs w:val="20"/>
+        </w:rPr>
+        <w:t>,</w:t>
       </w:r>
       <w:r>
         <w:rPr>
@@ -4178,58 +4335,33 @@
           <w:sz w:val="20"/>
           <w:szCs w:val="20"/>
         </w:rPr>
-        <w:t xml:space="preserve">a </w:t>
-      </w:r>
-      <w:r>
-        <w:rPr>
-          <w:rFonts w:ascii="Arial" w:hAnsi="Arial" w:cs="Arial"/>
-          <w:sz w:val="20"/>
-          <w:szCs w:val="20"/>
-        </w:rPr>
-        <w:t>strong t</w:t>
-      </w:r>
-      <w:r>
-        <w:rPr>
-          <w:rFonts w:ascii="Arial" w:hAnsi="Arial" w:cs="Arial"/>
-          <w:sz w:val="20"/>
-          <w:szCs w:val="20"/>
-        </w:rPr>
-        <w:t xml:space="preserve">ime </w:t>
-      </w:r>
-      <w:r>
-        <w:rPr>
-          <w:rFonts w:ascii="Arial" w:hAnsi="Arial" w:cs="Arial"/>
-          <w:sz w:val="20"/>
-          <w:szCs w:val="20"/>
-        </w:rPr>
-        <w:t xml:space="preserve">dependence </w:t>
-      </w:r>
-      <w:r>
-        <w:rPr>
-          <w:rFonts w:ascii="Arial" w:hAnsi="Arial" w:cs="Arial"/>
-          <w:sz w:val="20"/>
-          <w:szCs w:val="20"/>
-        </w:rPr>
-        <w:t xml:space="preserve">because of </w:t>
-      </w:r>
-      <w:r>
-        <w:rPr>
-          <w:rFonts w:ascii="Arial" w:hAnsi="Arial" w:cs="Arial"/>
-          <w:sz w:val="20"/>
-          <w:szCs w:val="20"/>
-        </w:rPr>
-        <w:t xml:space="preserve">demand inertia, </w:t>
-      </w:r>
-      <w:proofErr w:type="spellStart"/>
-      <w:r>
-        <w:rPr>
-          <w:rFonts w:ascii="Arial" w:hAnsi="Arial" w:cs="Arial"/>
-          <w:sz w:val="20"/>
-          <w:szCs w:val="20"/>
-        </w:rPr>
-        <w:t>pwer</w:t>
-      </w:r>
-      <w:proofErr w:type="spellEnd"/>
+        <w:t>P</w:t>
+      </w:r>
+      <w:r>
+        <w:rPr>
+          <w:rFonts w:ascii="Arial" w:hAnsi="Arial" w:cs="Arial"/>
+          <w:sz w:val="20"/>
+          <w:szCs w:val="20"/>
+        </w:rPr>
+        <w:t>rice</w:t>
+      </w:r>
+      <w:r>
+        <w:rPr>
+          <w:rFonts w:ascii="Arial" w:hAnsi="Arial" w:cs="Arial"/>
+          <w:sz w:val="20"/>
+          <w:szCs w:val="20"/>
+          <w:vertAlign w:val="subscript"/>
+        </w:rPr>
+        <w:t>72</w:t>
+      </w:r>
+      <w:r>
+        <w:rPr>
+          <w:rFonts w:ascii="Arial" w:hAnsi="Arial" w:cs="Arial"/>
+          <w:sz w:val="20"/>
+          <w:szCs w:val="20"/>
+        </w:rPr>
+        <w:t>,</w:t>
+      </w:r>
       <w:r>
         <w:rPr>
           <w:rFonts w:ascii="Arial" w:hAnsi="Arial" w:cs="Arial"/>
@@ -4244,31 +4376,32 @@
           <w:sz w:val="20"/>
           <w:szCs w:val="20"/>
         </w:rPr>
-        <w:t>generation scheduling, and market mechanisms</w:t>
-      </w:r>
-      <w:r>
-        <w:rPr>
-          <w:rFonts w:ascii="Arial" w:hAnsi="Arial" w:cs="Arial"/>
-          <w:sz w:val="20"/>
-          <w:szCs w:val="20"/>
-        </w:rPr>
-        <w:t xml:space="preserve">, </w:t>
-      </w:r>
-      <w:r>
-        <w:rPr>
-          <w:rFonts w:ascii="Arial" w:hAnsi="Arial" w:cs="Arial"/>
-          <w:sz w:val="20"/>
-          <w:szCs w:val="20"/>
-        </w:rPr>
-        <w:t xml:space="preserve">several lagged features were </w:t>
-      </w:r>
-      <w:r>
-        <w:rPr>
-          <w:rFonts w:ascii="Arial" w:hAnsi="Arial" w:cs="Arial"/>
-          <w:sz w:val="20"/>
-          <w:szCs w:val="20"/>
-        </w:rPr>
-        <w:t>designed</w:t>
+        <w:t>P</w:t>
+      </w:r>
+      <w:r>
+        <w:rPr>
+          <w:rFonts w:ascii="Arial" w:hAnsi="Arial" w:cs="Arial"/>
+          <w:sz w:val="20"/>
+          <w:szCs w:val="20"/>
+        </w:rPr>
+        <w:t>rice</w:t>
+      </w:r>
+      <w:r>
+        <w:rPr>
+          <w:rFonts w:ascii="Arial" w:hAnsi="Arial" w:cs="Arial"/>
+          <w:sz w:val="20"/>
+          <w:szCs w:val="20"/>
+          <w:vertAlign w:val="subscript"/>
+        </w:rPr>
+        <w:t>168</w:t>
+      </w:r>
+      <w:r>
+        <w:rPr>
+          <w:rFonts w:ascii="Arial" w:hAnsi="Arial" w:cs="Arial"/>
+          <w:sz w:val="20"/>
+          <w:szCs w:val="20"/>
+        </w:rPr>
+        <w:t>,</w:t>
       </w:r>
       <w:r>
         <w:rPr>
@@ -4284,23 +4417,32 @@
           <w:sz w:val="20"/>
           <w:szCs w:val="20"/>
         </w:rPr>
-        <w:t>capturing short-</w:t>
-      </w:r>
-      <w:r>
-        <w:rPr>
-          <w:rFonts w:ascii="Arial" w:hAnsi="Arial" w:cs="Arial"/>
-          <w:sz w:val="20"/>
-          <w:szCs w:val="20"/>
-        </w:rPr>
-        <w:t>term</w:t>
-      </w:r>
-      <w:r>
-        <w:rPr>
-          <w:rFonts w:ascii="Arial" w:hAnsi="Arial" w:cs="Arial"/>
-          <w:sz w:val="20"/>
-          <w:szCs w:val="20"/>
-        </w:rPr>
-        <w:t xml:space="preserve"> and medium-term dynamics.</w:t>
+        <w:t>P</w:t>
+      </w:r>
+      <w:r>
+        <w:rPr>
+          <w:rFonts w:ascii="Arial" w:hAnsi="Arial" w:cs="Arial"/>
+          <w:sz w:val="20"/>
+          <w:szCs w:val="20"/>
+        </w:rPr>
+        <w:t>rice</w:t>
+      </w:r>
+      <w:r>
+        <w:rPr>
+          <w:rFonts w:ascii="Arial" w:hAnsi="Arial" w:cs="Arial"/>
+          <w:sz w:val="20"/>
+          <w:szCs w:val="20"/>
+          <w:vertAlign w:val="subscript"/>
+        </w:rPr>
+        <w:t>336</w:t>
+      </w:r>
+      <w:r>
+        <w:rPr>
+          <w:rFonts w:ascii="Arial" w:hAnsi="Arial" w:cs="Arial"/>
+          <w:sz w:val="20"/>
+          <w:szCs w:val="20"/>
+        </w:rPr>
+        <w:t xml:space="preserve"> for 1-day, 3-days, 1-week and 2-weeks ago. </w:t>
       </w:r>
     </w:p>
     <w:p>
@@ -4320,182 +4462,6 @@
           <w:sz w:val="20"/>
           <w:szCs w:val="20"/>
         </w:rPr>
-        <w:t>Lagged prices:</w:t>
-      </w:r>
-      <w:r>
-        <w:rPr>
-          <w:rFonts w:ascii="Arial" w:hAnsi="Arial" w:cs="Arial"/>
-          <w:sz w:val="20"/>
-          <w:szCs w:val="20"/>
-        </w:rPr>
-        <w:t xml:space="preserve"> P</w:t>
-      </w:r>
-      <w:r>
-        <w:rPr>
-          <w:rFonts w:ascii="Arial" w:hAnsi="Arial" w:cs="Arial"/>
-          <w:sz w:val="20"/>
-          <w:szCs w:val="20"/>
-        </w:rPr>
-        <w:t>rice</w:t>
-      </w:r>
-      <w:r>
-        <w:rPr>
-          <w:rFonts w:ascii="Arial" w:hAnsi="Arial" w:cs="Arial"/>
-          <w:sz w:val="20"/>
-          <w:szCs w:val="20"/>
-          <w:vertAlign w:val="subscript"/>
-        </w:rPr>
-        <w:t>24</w:t>
-      </w:r>
-      <w:r>
-        <w:rPr>
-          <w:rFonts w:ascii="Arial" w:hAnsi="Arial" w:cs="Arial"/>
-          <w:sz w:val="20"/>
-          <w:szCs w:val="20"/>
-        </w:rPr>
-        <w:t>,</w:t>
-      </w:r>
-      <w:r>
-        <w:rPr>
-          <w:rFonts w:ascii="Arial" w:hAnsi="Arial" w:cs="Arial"/>
-          <w:sz w:val="20"/>
-          <w:szCs w:val="20"/>
-        </w:rPr>
-        <w:t xml:space="preserve"> </w:t>
-      </w:r>
-      <w:r>
-        <w:rPr>
-          <w:rFonts w:ascii="Arial" w:hAnsi="Arial" w:cs="Arial"/>
-          <w:sz w:val="20"/>
-          <w:szCs w:val="20"/>
-        </w:rPr>
-        <w:t>P</w:t>
-      </w:r>
-      <w:r>
-        <w:rPr>
-          <w:rFonts w:ascii="Arial" w:hAnsi="Arial" w:cs="Arial"/>
-          <w:sz w:val="20"/>
-          <w:szCs w:val="20"/>
-        </w:rPr>
-        <w:t>rice</w:t>
-      </w:r>
-      <w:r>
-        <w:rPr>
-          <w:rFonts w:ascii="Arial" w:hAnsi="Arial" w:cs="Arial"/>
-          <w:sz w:val="20"/>
-          <w:szCs w:val="20"/>
-          <w:vertAlign w:val="subscript"/>
-        </w:rPr>
-        <w:t>72</w:t>
-      </w:r>
-      <w:r>
-        <w:rPr>
-          <w:rFonts w:ascii="Arial" w:hAnsi="Arial" w:cs="Arial"/>
-          <w:sz w:val="20"/>
-          <w:szCs w:val="20"/>
-        </w:rPr>
-        <w:t>,</w:t>
-      </w:r>
-      <w:r>
-        <w:rPr>
-          <w:rFonts w:ascii="Arial" w:hAnsi="Arial" w:cs="Arial"/>
-          <w:sz w:val="20"/>
-          <w:szCs w:val="20"/>
-        </w:rPr>
-        <w:t xml:space="preserve"> </w:t>
-      </w:r>
-      <w:r>
-        <w:rPr>
-          <w:rFonts w:ascii="Arial" w:hAnsi="Arial" w:cs="Arial"/>
-          <w:sz w:val="20"/>
-          <w:szCs w:val="20"/>
-        </w:rPr>
-        <w:t>P</w:t>
-      </w:r>
-      <w:r>
-        <w:rPr>
-          <w:rFonts w:ascii="Arial" w:hAnsi="Arial" w:cs="Arial"/>
-          <w:sz w:val="20"/>
-          <w:szCs w:val="20"/>
-        </w:rPr>
-        <w:t>rice</w:t>
-      </w:r>
-      <w:r>
-        <w:rPr>
-          <w:rFonts w:ascii="Arial" w:hAnsi="Arial" w:cs="Arial"/>
-          <w:sz w:val="20"/>
-          <w:szCs w:val="20"/>
-          <w:vertAlign w:val="subscript"/>
-        </w:rPr>
-        <w:t>168</w:t>
-      </w:r>
-      <w:r>
-        <w:rPr>
-          <w:rFonts w:ascii="Arial" w:hAnsi="Arial" w:cs="Arial"/>
-          <w:sz w:val="20"/>
-          <w:szCs w:val="20"/>
-        </w:rPr>
-        <w:t>,</w:t>
-      </w:r>
-      <w:r>
-        <w:rPr>
-          <w:rFonts w:ascii="Arial" w:hAnsi="Arial" w:cs="Arial"/>
-          <w:sz w:val="20"/>
-          <w:szCs w:val="20"/>
-        </w:rPr>
-        <w:t xml:space="preserve"> </w:t>
-      </w:r>
-      <w:r>
-        <w:rPr>
-          <w:rFonts w:ascii="Arial" w:hAnsi="Arial" w:cs="Arial"/>
-          <w:sz w:val="20"/>
-          <w:szCs w:val="20"/>
-        </w:rPr>
-        <w:t>P</w:t>
-      </w:r>
-      <w:r>
-        <w:rPr>
-          <w:rFonts w:ascii="Arial" w:hAnsi="Arial" w:cs="Arial"/>
-          <w:sz w:val="20"/>
-          <w:szCs w:val="20"/>
-        </w:rPr>
-        <w:t>rice</w:t>
-      </w:r>
-      <w:r>
-        <w:rPr>
-          <w:rFonts w:ascii="Arial" w:hAnsi="Arial" w:cs="Arial"/>
-          <w:sz w:val="20"/>
-          <w:szCs w:val="20"/>
-          <w:vertAlign w:val="subscript"/>
-        </w:rPr>
-        <w:t>336</w:t>
-      </w:r>
-      <w:r>
-        <w:rPr>
-          <w:rFonts w:ascii="Arial" w:hAnsi="Arial" w:cs="Arial"/>
-          <w:sz w:val="20"/>
-          <w:szCs w:val="20"/>
-        </w:rPr>
-        <w:t xml:space="preserve"> for 1-day, 3-days, 1-week and 2-weeks ago. </w:t>
-      </w:r>
-    </w:p>
-    <w:p>
-      <w:pPr>
-        <w:spacing w:after="120" w:line="360" w:lineRule="auto"/>
-        <w:ind w:firstLine="720"/>
-        <w:jc w:val="both"/>
-        <w:rPr>
-          <w:rFonts w:ascii="Arial" w:hAnsi="Arial" w:cs="Arial"/>
-          <w:sz w:val="20"/>
-          <w:szCs w:val="20"/>
-        </w:rPr>
-      </w:pPr>
-      <w:r>
-        <w:rPr>
-          <w:rFonts w:ascii="Arial" w:hAnsi="Arial" w:cs="Arial"/>
-          <w:sz w:val="20"/>
-          <w:szCs w:val="20"/>
-        </w:rPr>
         <w:t xml:space="preserve">Lagged </w:t>
       </w:r>
       <w:r>
@@ -4666,7 +4632,6 @@
           <w:sz w:val="20"/>
           <w:szCs w:val="20"/>
         </w:rPr>
-        <w:lastRenderedPageBreak/>
         <w:t>C</w:t>
       </w:r>
       <w:r>
@@ -4844,7 +4809,7 @@
           <w:color w:val="auto"/>
         </w:rPr>
       </w:pPr>
-      <w:bookmarkStart w:id="9" w:name="_Toc216620297"/>
+      <w:bookmarkStart w:id="10" w:name="_Toc216620297"/>
       <w:r>
         <w:rPr>
           <w:rFonts w:ascii="Arial" w:hAnsi="Arial" w:cs="Arial"/>
@@ -4859,7 +4824,7 @@
         </w:rPr>
         <w:t>election</w:t>
       </w:r>
-      <w:bookmarkEnd w:id="9"/>
+      <w:bookmarkEnd w:id="10"/>
     </w:p>
     <w:p>
       <w:pPr>
@@ -4986,6 +4951,14 @@
         </w:rPr>
         <w:t xml:space="preserve"> features. Lagged variables with long horizons (e.g., 336 hours) were found to be strongly correlated with shorter lags and were retained only when they contributed additional explanatory value.</w:t>
       </w:r>
+      <w:r>
+        <w:rPr>
+          <w:rFonts w:ascii="Arial" w:hAnsi="Arial" w:cs="Arial"/>
+          <w:sz w:val="20"/>
+          <w:szCs w:val="20"/>
+        </w:rPr>
+        <w:t xml:space="preserve"> </w:t>
+      </w:r>
     </w:p>
     <w:p>
       <w:pPr>
@@ -5070,23 +5043,13 @@
         </w:rPr>
         <w:t xml:space="preserve">excessive imputation or </w:t>
       </w:r>
-      <w:proofErr w:type="gramStart"/>
-      <w:r>
-        <w:rPr>
-          <w:rFonts w:ascii="Arial" w:hAnsi="Arial" w:cs="Arial"/>
-          <w:sz w:val="20"/>
-          <w:szCs w:val="20"/>
-        </w:rPr>
-        <w:t>show</w:t>
-      </w:r>
-      <w:proofErr w:type="gramEnd"/>
-      <w:r>
-        <w:rPr>
-          <w:rFonts w:ascii="Arial" w:hAnsi="Arial" w:cs="Arial"/>
-          <w:sz w:val="20"/>
-          <w:szCs w:val="20"/>
-        </w:rPr>
-        <w:t xml:space="preserve"> a </w:t>
+      <w:r>
+        <w:rPr>
+          <w:rFonts w:ascii="Arial" w:hAnsi="Arial" w:cs="Arial"/>
+          <w:sz w:val="20"/>
+          <w:szCs w:val="20"/>
+        </w:rPr>
+        <w:t xml:space="preserve">show a </w:t>
       </w:r>
       <w:r>
         <w:rPr>
@@ -5167,6 +5130,22 @@
           <w:szCs w:val="20"/>
         </w:rPr>
         <w:t xml:space="preserve"> </w:t>
+      </w:r>
+      <w:r>
+        <w:rPr>
+          <w:rFonts w:ascii="Arial" w:hAnsi="Arial" w:cs="Arial"/>
+          <w:sz w:val="20"/>
+          <w:szCs w:val="20"/>
+        </w:rPr>
+        <w:t xml:space="preserve"> </w:t>
+      </w:r>
+      <w:r>
+        <w:rPr>
+          <w:rFonts w:ascii="Arial" w:hAnsi="Arial" w:cs="Arial"/>
+          <w:sz w:val="20"/>
+          <w:szCs w:val="20"/>
+        </w:rPr>
+        <w:t>Following this process, a final set of 14 predictor variables was retained for modelling. The selected features balance predictive power, physical interpretability, and data availability.</w:t>
       </w:r>
     </w:p>
     <w:p>
@@ -5290,6 +5269,7 @@
           <w:sz w:val="20"/>
           <w:szCs w:val="20"/>
         </w:rPr>
+        <w:lastRenderedPageBreak/>
         <w:t xml:space="preserve">Several types of </w:t>
       </w:r>
       <w:r>
@@ -5354,15 +5334,7 @@
           <w:sz w:val="20"/>
           <w:szCs w:val="20"/>
         </w:rPr>
-        <w:t>Gradient Boosting</w:t>
-      </w:r>
-      <w:r>
-        <w:rPr>
-          <w:rFonts w:ascii="Arial" w:hAnsi="Arial" w:cs="Arial"/>
-          <w:sz w:val="20"/>
-          <w:szCs w:val="20"/>
-        </w:rPr>
-        <w:t xml:space="preserve"> </w:t>
+        <w:t xml:space="preserve">Gradient Boosting </w:t>
       </w:r>
     </w:p>
     <w:p>
@@ -5576,7 +5548,6 @@
           <w:sz w:val="20"/>
           <w:szCs w:val="20"/>
         </w:rPr>
-        <w:lastRenderedPageBreak/>
         <w:t xml:space="preserve">A wide selection of models with varying levels of complexity, interpretability, and nonlinear representation capabilities helps to cover </w:t>
       </w:r>
       <w:r>
@@ -6291,6 +6262,7 @@
           <w:sz w:val="20"/>
           <w:szCs w:val="20"/>
         </w:rPr>
+        <w:lastRenderedPageBreak/>
         <w:t xml:space="preserve">The </w:t>
       </w:r>
       <w:r>
@@ -6332,6 +6304,14 @@
           <w:szCs w:val="20"/>
         </w:rPr>
         <w:t xml:space="preserve"> was selected as the baseline forecasting model.</w:t>
+      </w:r>
+      <w:r>
+        <w:rPr>
+          <w:rFonts w:ascii="Arial" w:hAnsi="Arial" w:cs="Arial"/>
+          <w:sz w:val="20"/>
+          <w:szCs w:val="20"/>
+        </w:rPr>
+        <w:t xml:space="preserve"> </w:t>
       </w:r>
     </w:p>
     <w:p>
@@ -6351,9 +6331,44 @@
           <w:sz w:val="20"/>
           <w:szCs w:val="20"/>
         </w:rPr>
+        <w:t>Despite its simplicity, Linear Regression achieved the best overall performance in terms of RMSE, MAE, and R², while also exhibiting lower variance across folds. This suggests that the relationship between the selected predictors and the spot price is largely linear and</w:t>
+      </w:r>
+      <w:r>
+        <w:rPr>
+          <w:rFonts w:ascii="Arial" w:hAnsi="Arial" w:cs="Arial"/>
+          <w:sz w:val="20"/>
+          <w:szCs w:val="20"/>
+        </w:rPr>
+        <w:t xml:space="preserve"> quite</w:t>
+      </w:r>
+      <w:r>
+        <w:rPr>
+          <w:rFonts w:ascii="Arial" w:hAnsi="Arial" w:cs="Arial"/>
+          <w:sz w:val="20"/>
+          <w:szCs w:val="20"/>
+        </w:rPr>
+        <w:t xml:space="preserve"> well captured by the engineered features.</w:t>
+      </w:r>
+    </w:p>
+    <w:p>
+      <w:pPr>
+        <w:spacing w:after="120" w:line="360" w:lineRule="auto"/>
+        <w:ind w:firstLine="717"/>
+        <w:jc w:val="both"/>
+        <w:rPr>
+          <w:rFonts w:ascii="Arial" w:hAnsi="Arial" w:cs="Arial"/>
+          <w:sz w:val="20"/>
+          <w:szCs w:val="20"/>
+        </w:rPr>
+      </w:pPr>
+      <w:r>
+        <w:rPr>
+          <w:rFonts w:ascii="Arial" w:hAnsi="Arial" w:cs="Arial"/>
+          <w:sz w:val="20"/>
+          <w:szCs w:val="20"/>
+        </w:rPr>
         <w:t xml:space="preserve">Following model selection, hyperparameter tuning is performed to further improve </w:t>
       </w:r>
-      <w:proofErr w:type="gramStart"/>
       <w:r>
         <w:rPr>
           <w:rFonts w:ascii="Arial" w:hAnsi="Arial" w:cs="Arial"/>
@@ -6368,16 +6383,7 @@
           <w:sz w:val="20"/>
           <w:szCs w:val="20"/>
         </w:rPr>
-        <w:t>predictive</w:t>
-      </w:r>
-      <w:proofErr w:type="gramEnd"/>
-      <w:r>
-        <w:rPr>
-          <w:rFonts w:ascii="Arial" w:hAnsi="Arial" w:cs="Arial"/>
-          <w:sz w:val="20"/>
-          <w:szCs w:val="20"/>
-        </w:rPr>
-        <w:t xml:space="preserve"> performance. However, </w:t>
+        <w:t xml:space="preserve">predictive performance. However, </w:t>
       </w:r>
       <w:r>
         <w:rPr>
@@ -6509,7 +6515,31 @@
           <w:sz w:val="20"/>
           <w:szCs w:val="20"/>
         </w:rPr>
-        <w:t xml:space="preserve"> test period corresponding to September 2025. The resulting performance metrics and their interpretation are presented in the Findings section.</w:t>
+        <w:t xml:space="preserve"> test period corresponding to September 2025. </w:t>
+      </w:r>
+      <w:r>
+        <w:rPr>
+          <w:rFonts w:ascii="Arial" w:hAnsi="Arial" w:cs="Arial"/>
+          <w:sz w:val="20"/>
+          <w:szCs w:val="20"/>
+        </w:rPr>
+        <w:t>All variables used for supervised learning are restricted to information available before market clearing, to prevent data leakage.</w:t>
+      </w:r>
+      <w:r>
+        <w:rPr>
+          <w:rFonts w:ascii="Arial" w:hAnsi="Arial" w:cs="Arial"/>
+          <w:sz w:val="20"/>
+          <w:szCs w:val="20"/>
+        </w:rPr>
+        <w:t xml:space="preserve"> </w:t>
+      </w:r>
+      <w:r>
+        <w:rPr>
+          <w:rFonts w:ascii="Arial" w:hAnsi="Arial" w:cs="Arial"/>
+          <w:sz w:val="20"/>
+          <w:szCs w:val="20"/>
+        </w:rPr>
+        <w:t>The resulting performance metrics and their interpretation are presented in the Findings section.</w:t>
       </w:r>
     </w:p>
     <w:p>
@@ -6521,38 +6551,37 @@
           <w:color w:val="auto"/>
         </w:rPr>
       </w:pPr>
-      <w:bookmarkStart w:id="10" w:name="_Toc216620298"/>
+      <w:bookmarkStart w:id="11" w:name="_Toc216620298"/>
       <w:r>
         <w:rPr>
           <w:rFonts w:ascii="Arial" w:hAnsi="Arial" w:cs="Arial"/>
           <w:color w:val="auto"/>
         </w:rPr>
-        <w:lastRenderedPageBreak/>
         <w:t>Clustering daily electricity price profiles</w:t>
-      </w:r>
-      <w:bookmarkEnd w:id="10"/>
-    </w:p>
-    <w:p>
-      <w:pPr>
-        <w:pStyle w:val="Heading2"/>
-        <w:ind w:firstLine="357"/>
-        <w:rPr>
-          <w:rFonts w:ascii="Arial" w:hAnsi="Arial" w:cs="Arial"/>
-          <w:color w:val="auto"/>
-        </w:rPr>
-      </w:pPr>
-      <w:bookmarkStart w:id="11" w:name="_Toc216620299"/>
-      <w:r>
-        <w:rPr>
-          <w:rFonts w:ascii="Arial" w:hAnsi="Arial" w:cs="Arial"/>
-          <w:color w:val="auto"/>
-        </w:rPr>
-        <w:t>Application of PCA and comparison with the regression model</w:t>
       </w:r>
       <w:bookmarkEnd w:id="11"/>
     </w:p>
     <w:p>
       <w:pPr>
+        <w:pStyle w:val="Heading2"/>
+        <w:ind w:firstLine="357"/>
+        <w:rPr>
+          <w:rFonts w:ascii="Arial" w:hAnsi="Arial" w:cs="Arial"/>
+          <w:color w:val="auto"/>
+        </w:rPr>
+      </w:pPr>
+      <w:bookmarkStart w:id="12" w:name="_Toc216620299"/>
+      <w:r>
+        <w:rPr>
+          <w:rFonts w:ascii="Arial" w:hAnsi="Arial" w:cs="Arial"/>
+          <w:color w:val="auto"/>
+        </w:rPr>
+        <w:t>Application of PCA and comparison with the regression model</w:t>
+      </w:r>
+      <w:bookmarkEnd w:id="12"/>
+    </w:p>
+    <w:p>
+      <w:pPr>
         <w:spacing w:after="120" w:line="360" w:lineRule="auto"/>
         <w:ind w:firstLine="720"/>
         <w:jc w:val="both"/>
@@ -6583,31 +6612,13 @@
           <w:color w:val="auto"/>
         </w:rPr>
       </w:pPr>
-      <w:bookmarkStart w:id="12" w:name="_Toc216620300"/>
+      <w:bookmarkStart w:id="13" w:name="_Toc216620300"/>
       <w:r>
         <w:rPr>
           <w:rFonts w:ascii="Arial" w:hAnsi="Arial" w:cs="Arial"/>
           <w:color w:val="auto"/>
         </w:rPr>
         <w:t>Findings</w:t>
-      </w:r>
-      <w:bookmarkEnd w:id="12"/>
-    </w:p>
-    <w:p>
-      <w:pPr>
-        <w:pStyle w:val="Heading1"/>
-        <w:rPr>
-          <w:rFonts w:ascii="Arial" w:hAnsi="Arial" w:cs="Arial"/>
-          <w:color w:val="auto"/>
-        </w:rPr>
-      </w:pPr>
-      <w:bookmarkStart w:id="13" w:name="_Toc216620301"/>
-      <w:r>
-        <w:rPr>
-          <w:rFonts w:ascii="Arial" w:hAnsi="Arial" w:cs="Arial"/>
-          <w:color w:val="auto"/>
-        </w:rPr>
-        <w:t>Conclusions</w:t>
       </w:r>
       <w:bookmarkEnd w:id="13"/>
     </w:p>
@@ -6619,20 +6630,38 @@
           <w:color w:val="auto"/>
         </w:rPr>
       </w:pPr>
-      <w:bookmarkStart w:id="14" w:name="_Toc216620302"/>
+      <w:bookmarkStart w:id="14" w:name="_Toc216620301"/>
       <w:r>
         <w:rPr>
           <w:rFonts w:ascii="Arial" w:hAnsi="Arial" w:cs="Arial"/>
           <w:color w:val="auto"/>
         </w:rPr>
+        <w:t>Conclusions</w:t>
+      </w:r>
+      <w:bookmarkEnd w:id="14"/>
+    </w:p>
+    <w:p>
+      <w:pPr>
+        <w:pStyle w:val="Heading1"/>
+        <w:rPr>
+          <w:rFonts w:ascii="Arial" w:hAnsi="Arial" w:cs="Arial"/>
+          <w:color w:val="auto"/>
+        </w:rPr>
+      </w:pPr>
+      <w:bookmarkStart w:id="15" w:name="_Toc216620302"/>
+      <w:r>
+        <w:rPr>
+          <w:rFonts w:ascii="Arial" w:hAnsi="Arial" w:cs="Arial"/>
+          <w:color w:val="auto"/>
+        </w:rPr>
         <w:t>Challenges faced</w:t>
       </w:r>
-      <w:bookmarkEnd w:id="14"/>
+      <w:bookmarkEnd w:id="15"/>
     </w:p>
     <w:p/>
     <w:sectPr>
-      <w:headerReference w:type="default" r:id="rId9"/>
-      <w:footerReference w:type="default" r:id="rId10"/>
+      <w:headerReference w:type="default" r:id="rId13"/>
+      <w:footerReference w:type="default" r:id="rId14"/>
       <w:pgSz w:w="12240" w:h="15840"/>
       <w:pgMar w:top="1440" w:right="1440" w:bottom="1440" w:left="1440" w:header="720" w:footer="624" w:gutter="0"/>
       <w:cols w:space="720"/>
@@ -6641,6 +6670,74 @@
     </w:sectPr>
   </w:body>
 </w:document>
+</file>
+
+<file path=word/comments.xml><?xml version="1.0" encoding="utf-8"?>
+<w:comments xmlns:wpc="http://schemas.microsoft.com/office/word/2010/wordprocessingCanvas" xmlns:cx="http://schemas.microsoft.com/office/drawing/2014/chartex" xmlns:cx1="http://schemas.microsoft.com/office/drawing/2015/9/8/chartex" xmlns:cx2="http://schemas.microsoft.com/office/drawing/2015/10/21/chartex" xmlns:cx3="http://schemas.microsoft.com/office/drawing/2016/5/9/chartex" xmlns:cx4="http://schemas.microsoft.com/office/drawing/2016/5/10/chartex" xmlns:cx5="http://schemas.microsoft.com/office/drawing/2016/5/11/chartex" xmlns:cx6="http://schemas.microsoft.com/office/drawing/2016/5/12/chartex" xmlns:cx7="http://schemas.microsoft.com/office/drawing/2016/5/13/chartex" xmlns:cx8="http://schemas.microsoft.com/office/drawing/2016/5/14/chartex" xmlns:mc="http://schemas.openxmlformats.org/markup-compatibility/2006" xmlns:aink="http://schemas.microsoft.com/office/drawing/2016/ink" xmlns:am3d="http://schemas.microsoft.com/office/drawing/2017/model3d" xmlns:o="urn:schemas-microsoft-com:office:office" xmlns:oel="http://schemas.microsoft.com/office/2019/extlst" xmlns:r="http://schemas.openxmlformats.org/officeDocument/2006/relationships" xmlns:m="http://schemas.openxmlformats.org/officeDocument/2006/math" xmlns:v="urn:schemas-microsoft-com:vml" xmlns:wp14="http://schemas.microsoft.com/office/word/2010/wordprocessingDrawing" xmlns:wp="http://schemas.openxmlformats.org/drawingml/2006/wordprocessingDrawing" xmlns:w10="urn:schemas-microsoft-com:office:word" xmlns:w="http://schemas.openxmlformats.org/wordprocessingml/2006/main" xmlns:w14="http://schemas.microsoft.com/office/word/2010/wordml" xmlns:w15="http://schemas.microsoft.com/office/word/2012/wordml" xmlns:w16cex="http://schemas.microsoft.com/office/word/2018/wordml/cex" xmlns:w16cid="http://schemas.microsoft.com/office/word/2016/wordml/cid" xmlns:w16="http://schemas.microsoft.com/office/word/2018/wordml" xmlns:w16du="http://schemas.microsoft.com/office/word/2023/wordml/word16du" xmlns:w16sdtdh="http://schemas.microsoft.com/office/word/2020/wordml/sdtdatahash" xmlns:w16sdtfl="http://schemas.microsoft.com/office/word/2024/wordml/sdtformatlock" xmlns:w16se="http://schemas.microsoft.com/office/word/2015/wordml/symex" xmlns:wpg="http://schemas.microsoft.com/office/word/2010/wordprocessingGroup" xmlns:wpi="http://schemas.microsoft.com/office/word/2010/wordprocessingInk" xmlns:wne="http://schemas.microsoft.com/office/word/2006/wordml" xmlns:wps="http://schemas.microsoft.com/office/word/2010/wordprocessingShape" mc:Ignorable="w14 w15 w16se w16cid w16 w16cex w16sdtdh w16sdtfl w16du wp14">
+  <w:comment w:id="0" w:author="Davide Turrina" w:date="2025-12-17T03:36:00Z" w:initials="DT">
+    <w:p>
+      <w:pPr>
+        <w:pStyle w:val="CommentText"/>
+      </w:pPr>
+      <w:r>
+        <w:rPr>
+          <w:rStyle w:val="CommentReference"/>
+        </w:rPr>
+        <w:annotationRef/>
+      </w:r>
+      <w:r>
+        <w:t>I’ve made some minor changings in the notebook. Now is complete and polished in my opinion (apart of the linear regression results).</w:t>
+      </w:r>
+      <w:r>
+        <w:br/>
+      </w:r>
+      <w:r>
+        <w:br/>
+        <w:t xml:space="preserve">Missing: last parts (cluster and PCA sections) note that i’ve made some changes in the notebook for that part. </w:t>
+      </w:r>
+      <w:r>
+        <w:br/>
+      </w:r>
+      <w:r>
+        <w:br/>
+        <w:t xml:space="preserve">IMPORTANT (also in notebook): change this </w:t>
+      </w:r>
+      <w:r>
+        <w:rPr>
+          <w:color w:val="CCCCCC"/>
+          <w:highlight w:val="black"/>
+        </w:rPr>
+        <w:t xml:space="preserve">    Original model: RMSE 14.46 / MAE 10.69 / R2 0.886 </w:t>
+      </w:r>
+    </w:p>
+    <w:p>
+      <w:pPr>
+        <w:pStyle w:val="CommentText"/>
+      </w:pPr>
+      <w:r>
+        <w:t xml:space="preserve">to the real values obtained in the notebook. If those are the ones , tell me why I have different values please . Thank you ! </w:t>
+      </w:r>
+    </w:p>
+  </w:comment>
+</w:comments>
+</file>
+
+<file path=word/commentsExtended.xml><?xml version="1.0" encoding="utf-8"?>
+<w15:commentsEx xmlns:wpc="http://schemas.microsoft.com/office/word/2010/wordprocessingCanvas" xmlns:cx="http://schemas.microsoft.com/office/drawing/2014/chartex" xmlns:cx1="http://schemas.microsoft.com/office/drawing/2015/9/8/chartex" xmlns:cx2="http://schemas.microsoft.com/office/drawing/2015/10/21/chartex" xmlns:cx3="http://schemas.microsoft.com/office/drawing/2016/5/9/chartex" xmlns:cx4="http://schemas.microsoft.com/office/drawing/2016/5/10/chartex" xmlns:cx5="http://schemas.microsoft.com/office/drawing/2016/5/11/chartex" xmlns:cx6="http://schemas.microsoft.com/office/drawing/2016/5/12/chartex" xmlns:cx7="http://schemas.microsoft.com/office/drawing/2016/5/13/chartex" xmlns:cx8="http://schemas.microsoft.com/office/drawing/2016/5/14/chartex" xmlns:mc="http://schemas.openxmlformats.org/markup-compatibility/2006" xmlns:aink="http://schemas.microsoft.com/office/drawing/2016/ink" xmlns:am3d="http://schemas.microsoft.com/office/drawing/2017/model3d" xmlns:o="urn:schemas-microsoft-com:office:office" xmlns:oel="http://schemas.microsoft.com/office/2019/extlst" xmlns:r="http://schemas.openxmlformats.org/officeDocument/2006/relationships" xmlns:m="http://schemas.openxmlformats.org/officeDocument/2006/math" xmlns:v="urn:schemas-microsoft-com:vml" xmlns:wp14="http://schemas.microsoft.com/office/word/2010/wordprocessingDrawing" xmlns:wp="http://schemas.openxmlformats.org/drawingml/2006/wordprocessingDrawing" xmlns:w10="urn:schemas-microsoft-com:office:word" xmlns:w="http://schemas.openxmlformats.org/wordprocessingml/2006/main" xmlns:w14="http://schemas.microsoft.com/office/word/2010/wordml" xmlns:w15="http://schemas.microsoft.com/office/word/2012/wordml" xmlns:w16cex="http://schemas.microsoft.com/office/word/2018/wordml/cex" xmlns:w16cid="http://schemas.microsoft.com/office/word/2016/wordml/cid" xmlns:w16="http://schemas.microsoft.com/office/word/2018/wordml" xmlns:w16du="http://schemas.microsoft.com/office/word/2023/wordml/word16du" xmlns:w16sdtdh="http://schemas.microsoft.com/office/word/2020/wordml/sdtdatahash" xmlns:w16sdtfl="http://schemas.microsoft.com/office/word/2024/wordml/sdtformatlock" xmlns:w16se="http://schemas.microsoft.com/office/word/2015/wordml/symex" xmlns:wpg="http://schemas.microsoft.com/office/word/2010/wordprocessingGroup" xmlns:wpi="http://schemas.microsoft.com/office/word/2010/wordprocessingInk" xmlns:wne="http://schemas.microsoft.com/office/word/2006/wordml" xmlns:wps="http://schemas.microsoft.com/office/word/2010/wordprocessingShape" mc:Ignorable="w14 w15 w16se w16cid w16 w16cex w16sdtdh w16sdtfl w16du wp14">
+  <w15:commentEx w15:paraId="0644AE0A" w15:done="0"/>
+</w15:commentsEx>
+</file>
+
+<file path=word/commentsExtensible.xml><?xml version="1.0" encoding="utf-8"?>
+<w16cex:commentsExtensible xmlns:wpc="http://schemas.microsoft.com/office/word/2010/wordprocessingCanvas" xmlns:cx="http://schemas.microsoft.com/office/drawing/2014/chartex" xmlns:cx1="http://schemas.microsoft.com/office/drawing/2015/9/8/chartex" xmlns:cx2="http://schemas.microsoft.com/office/drawing/2015/10/21/chartex" xmlns:cx3="http://schemas.microsoft.com/office/drawing/2016/5/9/chartex" xmlns:cx4="http://schemas.microsoft.com/office/drawing/2016/5/10/chartex" xmlns:cx5="http://schemas.microsoft.com/office/drawing/2016/5/11/chartex" xmlns:cx6="http://schemas.microsoft.com/office/drawing/2016/5/12/chartex" xmlns:cx7="http://schemas.microsoft.com/office/drawing/2016/5/13/chartex" xmlns:cx8="http://schemas.microsoft.com/office/drawing/2016/5/14/chartex" xmlns:cr="http://schemas.microsoft.com/office/comments/2020/reactions" xmlns:mc="http://schemas.openxmlformats.org/markup-compatibility/2006" xmlns:aink="http://schemas.microsoft.com/office/drawing/2016/ink" xmlns:am3d="http://schemas.microsoft.com/office/drawing/2017/model3d" xmlns:o="urn:schemas-microsoft-com:office:office" xmlns:oel="http://schemas.microsoft.com/office/2019/extlst" xmlns:r="http://schemas.openxmlformats.org/officeDocument/2006/relationships" xmlns:m="http://schemas.openxmlformats.org/officeDocument/2006/math" xmlns:v="urn:schemas-microsoft-com:vml" xmlns:wp14="http://schemas.microsoft.com/office/word/2010/wordprocessingDrawing" xmlns:wp="http://schemas.openxmlformats.org/drawingml/2006/wordprocessingDrawing" xmlns:w10="urn:schemas-microsoft-com:office:word" xmlns:w="http://schemas.openxmlformats.org/wordprocessingml/2006/main" xmlns:w14="http://schemas.microsoft.com/office/word/2010/wordml" xmlns:w15="http://schemas.microsoft.com/office/word/2012/wordml" xmlns:w16cex="http://schemas.microsoft.com/office/word/2018/wordml/cex" xmlns:w16cid="http://schemas.microsoft.com/office/word/2016/wordml/cid" xmlns:w16="http://schemas.microsoft.com/office/word/2018/wordml" xmlns:w16du="http://schemas.microsoft.com/office/word/2023/wordml/word16du" xmlns:w16sdtdh="http://schemas.microsoft.com/office/word/2020/wordml/sdtdatahash" xmlns:w16sdtfl="http://schemas.microsoft.com/office/word/2024/wordml/sdtformatlock" xmlns:w16se="http://schemas.microsoft.com/office/word/2015/wordml/symex" xmlns:wpg="http://schemas.microsoft.com/office/word/2010/wordprocessingGroup" xmlns:wpi="http://schemas.microsoft.com/office/word/2010/wordprocessingInk" xmlns:wne="http://schemas.microsoft.com/office/word/2006/wordml" xmlns:wps="http://schemas.microsoft.com/office/word/2010/wordprocessingShape" mc:Ignorable="w14 w15 w16se w16cid w16 w16cex w16sdtdh w16sdtfl cr w16du wp14">
+  <w16cex:commentExtensible w16cex:durableId="1EB06E43" w16cex:dateUtc="2025-12-17T02:36:00Z"/>
+</w16cex:commentsExtensible>
+</file>
+
+<file path=word/commentsIds.xml><?xml version="1.0" encoding="utf-8"?>
+<w16cid:commentsIds xmlns:wpc="http://schemas.microsoft.com/office/word/2010/wordprocessingCanvas" xmlns:cx="http://schemas.microsoft.com/office/drawing/2014/chartex" xmlns:cx1="http://schemas.microsoft.com/office/drawing/2015/9/8/chartex" xmlns:cx2="http://schemas.microsoft.com/office/drawing/2015/10/21/chartex" xmlns:cx3="http://schemas.microsoft.com/office/drawing/2016/5/9/chartex" xmlns:cx4="http://schemas.microsoft.com/office/drawing/2016/5/10/chartex" xmlns:cx5="http://schemas.microsoft.com/office/drawing/2016/5/11/chartex" xmlns:cx6="http://schemas.microsoft.com/office/drawing/2016/5/12/chartex" xmlns:cx7="http://schemas.microsoft.com/office/drawing/2016/5/13/chartex" xmlns:cx8="http://schemas.microsoft.com/office/drawing/2016/5/14/chartex" xmlns:mc="http://schemas.openxmlformats.org/markup-compatibility/2006" xmlns:aink="http://schemas.microsoft.com/office/drawing/2016/ink" xmlns:am3d="http://schemas.microsoft.com/office/drawing/2017/model3d" xmlns:o="urn:schemas-microsoft-com:office:office" xmlns:oel="http://schemas.microsoft.com/office/2019/extlst" xmlns:r="http://schemas.openxmlformats.org/officeDocument/2006/relationships" xmlns:m="http://schemas.openxmlformats.org/officeDocument/2006/math" xmlns:v="urn:schemas-microsoft-com:vml" xmlns:wp14="http://schemas.microsoft.com/office/word/2010/wordprocessingDrawing" xmlns:wp="http://schemas.openxmlformats.org/drawingml/2006/wordprocessingDrawing" xmlns:w10="urn:schemas-microsoft-com:office:word" xmlns:w="http://schemas.openxmlformats.org/wordprocessingml/2006/main" xmlns:w14="http://schemas.microsoft.com/office/word/2010/wordml" xmlns:w15="http://schemas.microsoft.com/office/word/2012/wordml" xmlns:w16cex="http://schemas.microsoft.com/office/word/2018/wordml/cex" xmlns:w16cid="http://schemas.microsoft.com/office/word/2016/wordml/cid" xmlns:w16="http://schemas.microsoft.com/office/word/2018/wordml" xmlns:w16du="http://schemas.microsoft.com/office/word/2023/wordml/word16du" xmlns:w16sdtdh="http://schemas.microsoft.com/office/word/2020/wordml/sdtdatahash" xmlns:w16sdtfl="http://schemas.microsoft.com/office/word/2024/wordml/sdtformatlock" xmlns:w16se="http://schemas.microsoft.com/office/word/2015/wordml/symex" xmlns:wpg="http://schemas.microsoft.com/office/word/2010/wordprocessingGroup" xmlns:wpi="http://schemas.microsoft.com/office/word/2010/wordprocessingInk" xmlns:wne="http://schemas.microsoft.com/office/word/2006/wordml" xmlns:wps="http://schemas.microsoft.com/office/word/2010/wordprocessingShape" mc:Ignorable="w14 w15 w16se w16cid w16 w16cex w16sdtdh w16sdtfl w16du wp14">
+  <w16cid:commentId w16cid:paraId="0644AE0A" w16cid:durableId="1EB06E43"/>
+</w16cid:commentsIds>
 </file>
 
 <file path=word/endnotes.xml><?xml version="1.0" encoding="utf-8"?>
@@ -6865,36 +6962,7 @@
         <w:szCs w:val="20"/>
         <w:lang w:val="pt-PT"/>
       </w:rPr>
-      <w:t xml:space="preserve">Regules, </w:t>
-    </w:r>
-    <w:proofErr w:type="spellStart"/>
-    <w:r>
-      <w:rPr>
-        <w:rFonts w:ascii="Arial" w:hAnsi="Arial" w:cs="Arial"/>
-        <w:sz w:val="20"/>
-        <w:szCs w:val="20"/>
-        <w:lang w:val="pt-PT"/>
-      </w:rPr>
-      <w:t>Turrina</w:t>
-    </w:r>
-    <w:proofErr w:type="spellEnd"/>
-    <w:r>
-      <w:rPr>
-        <w:rFonts w:ascii="Arial" w:hAnsi="Arial" w:cs="Arial"/>
-        <w:sz w:val="20"/>
-        <w:szCs w:val="20"/>
-        <w:lang w:val="pt-PT"/>
-      </w:rPr>
-      <w:t xml:space="preserve"> &amp;</w:t>
-    </w:r>
-    <w:r>
-      <w:rPr>
-        <w:rFonts w:ascii="Arial" w:hAnsi="Arial" w:cs="Arial"/>
-        <w:sz w:val="20"/>
-        <w:szCs w:val="20"/>
-        <w:lang w:val="pt-PT"/>
-      </w:rPr>
-      <w:t xml:space="preserve"> </w:t>
+      <w:t xml:space="preserve">Regules, Turrina &amp; </w:t>
     </w:r>
     <w:r>
       <w:rPr>
@@ -11075,6 +11143,14 @@
     <w:abstractNumId w:val="20"/>
   </w:num>
 </w:numbering>
+</file>
+
+<file path=word/people.xml><?xml version="1.0" encoding="utf-8"?>
+<w15:people xmlns:wpc="http://schemas.microsoft.com/office/word/2010/wordprocessingCanvas" xmlns:cx="http://schemas.microsoft.com/office/drawing/2014/chartex" xmlns:cx1="http://schemas.microsoft.com/office/drawing/2015/9/8/chartex" xmlns:cx2="http://schemas.microsoft.com/office/drawing/2015/10/21/chartex" xmlns:cx3="http://schemas.microsoft.com/office/drawing/2016/5/9/chartex" xmlns:cx4="http://schemas.microsoft.com/office/drawing/2016/5/10/chartex" xmlns:cx5="http://schemas.microsoft.com/office/drawing/2016/5/11/chartex" xmlns:cx6="http://schemas.microsoft.com/office/drawing/2016/5/12/chartex" xmlns:cx7="http://schemas.microsoft.com/office/drawing/2016/5/13/chartex" xmlns:cx8="http://schemas.microsoft.com/office/drawing/2016/5/14/chartex" xmlns:mc="http://schemas.openxmlformats.org/markup-compatibility/2006" xmlns:aink="http://schemas.microsoft.com/office/drawing/2016/ink" xmlns:am3d="http://schemas.microsoft.com/office/drawing/2017/model3d" xmlns:o="urn:schemas-microsoft-com:office:office" xmlns:oel="http://schemas.microsoft.com/office/2019/extlst" xmlns:r="http://schemas.openxmlformats.org/officeDocument/2006/relationships" xmlns:m="http://schemas.openxmlformats.org/officeDocument/2006/math" xmlns:v="urn:schemas-microsoft-com:vml" xmlns:wp14="http://schemas.microsoft.com/office/word/2010/wordprocessingDrawing" xmlns:wp="http://schemas.openxmlformats.org/drawingml/2006/wordprocessingDrawing" xmlns:w10="urn:schemas-microsoft-com:office:word" xmlns:w="http://schemas.openxmlformats.org/wordprocessingml/2006/main" xmlns:w14="http://schemas.microsoft.com/office/word/2010/wordml" xmlns:w15="http://schemas.microsoft.com/office/word/2012/wordml" xmlns:w16cex="http://schemas.microsoft.com/office/word/2018/wordml/cex" xmlns:w16cid="http://schemas.microsoft.com/office/word/2016/wordml/cid" xmlns:w16="http://schemas.microsoft.com/office/word/2018/wordml" xmlns:w16du="http://schemas.microsoft.com/office/word/2023/wordml/word16du" xmlns:w16sdtdh="http://schemas.microsoft.com/office/word/2020/wordml/sdtdatahash" xmlns:w16sdtfl="http://schemas.microsoft.com/office/word/2024/wordml/sdtformatlock" xmlns:w16se="http://schemas.microsoft.com/office/word/2015/wordml/symex" xmlns:wpg="http://schemas.microsoft.com/office/word/2010/wordprocessingGroup" xmlns:wpi="http://schemas.microsoft.com/office/word/2010/wordprocessingInk" xmlns:wne="http://schemas.microsoft.com/office/word/2006/wordml" xmlns:wps="http://schemas.microsoft.com/office/word/2010/wordprocessingShape" mc:Ignorable="w14 w15 w16se w16cid w16 w16cex w16sdtdh w16sdtfl w16du wp14">
+  <w15:person w15:author="Davide Turrina">
+    <w15:presenceInfo w15:providerId="AD" w15:userId="S::davide.turrina@office365.estudiantat.upc.edu::616a6018-4689-484c-8cd4-66c2ec5c70be"/>
+  </w15:person>
+</w15:people>
 </file>
 
 <file path=word/styles.xml><?xml version="1.0" encoding="utf-8"?>
@@ -11679,6 +11755,7 @@
   <w:style w:type="character" w:default="1" w:styleId="DefaultParagraphFont">
     <w:name w:val="Default Paragraph Font"/>
     <w:uiPriority w:val="1"/>
+    <w:semiHidden/>
     <w:unhideWhenUsed/>
   </w:style>
   <w:style w:type="table" w:default="1" w:styleId="TableNormal">
@@ -12119,6 +12196,72 @@
       <w:ind w:left="480"/>
     </w:pPr>
   </w:style>
+  <w:style w:type="character" w:styleId="CommentReference">
+    <w:name w:val="annotation reference"/>
+    <w:basedOn w:val="DefaultParagraphFont"/>
+    <w:uiPriority w:val="99"/>
+    <w:semiHidden/>
+    <w:unhideWhenUsed/>
+    <w:rsid w:val="00573A23"/>
+    <w:rPr>
+      <w:sz w:val="16"/>
+      <w:szCs w:val="16"/>
+    </w:rPr>
+  </w:style>
+  <w:style w:type="paragraph" w:styleId="CommentText">
+    <w:name w:val="annotation text"/>
+    <w:basedOn w:val="Normal"/>
+    <w:link w:val="CommentTextChar"/>
+    <w:uiPriority w:val="99"/>
+    <w:unhideWhenUsed/>
+    <w:rsid w:val="00573A23"/>
+    <w:pPr>
+      <w:spacing w:line="240" w:lineRule="auto"/>
+    </w:pPr>
+    <w:rPr>
+      <w:sz w:val="20"/>
+      <w:szCs w:val="20"/>
+    </w:rPr>
+  </w:style>
+  <w:style w:type="character" w:customStyle="1" w:styleId="CommentTextChar">
+    <w:name w:val="Comment Text Char"/>
+    <w:basedOn w:val="DefaultParagraphFont"/>
+    <w:link w:val="CommentText"/>
+    <w:uiPriority w:val="99"/>
+    <w:rsid w:val="00573A23"/>
+    <w:rPr>
+      <w:sz w:val="20"/>
+      <w:szCs w:val="20"/>
+    </w:rPr>
+  </w:style>
+  <w:style w:type="paragraph" w:styleId="CommentSubject">
+    <w:name w:val="annotation subject"/>
+    <w:basedOn w:val="CommentText"/>
+    <w:next w:val="CommentText"/>
+    <w:link w:val="CommentSubjectChar"/>
+    <w:uiPriority w:val="99"/>
+    <w:semiHidden/>
+    <w:unhideWhenUsed/>
+    <w:rsid w:val="00573A23"/>
+    <w:rPr>
+      <w:b/>
+      <w:bCs/>
+    </w:rPr>
+  </w:style>
+  <w:style w:type="character" w:customStyle="1" w:styleId="CommentSubjectChar">
+    <w:name w:val="Comment Subject Char"/>
+    <w:basedOn w:val="CommentTextChar"/>
+    <w:link w:val="CommentSubject"/>
+    <w:uiPriority w:val="99"/>
+    <w:semiHidden/>
+    <w:rsid w:val="00573A23"/>
+    <w:rPr>
+      <w:b/>
+      <w:bCs/>
+      <w:sz w:val="20"/>
+      <w:szCs w:val="20"/>
+    </w:rPr>
+  </w:style>
 </w:styles>
 </file>
 

</xml_diff>